<commit_message>
completed assignment 4 dsa
</commit_message>
<xml_diff>
--- a/CSC-575-DSA/Assignments/Assignment 4/Assignment 4 F.docx
+++ b/CSC-575-DSA/Assignments/Assignment 4/Assignment 4 F.docx
@@ -1,6 +1,6 @@
 
 <file path=word/document.xml><?xml version="1.0" encoding="utf-8"?>
-<w:document xmlns:wpc="http://schemas.microsoft.com/office/word/2010/wordprocessingCanvas" xmlns:cx="http://schemas.microsoft.com/office/drawing/2014/chartex" xmlns:cx1="http://schemas.microsoft.com/office/drawing/2015/9/8/chartex" xmlns:cx2="http://schemas.microsoft.com/office/drawing/2015/10/21/chartex" xmlns:cx3="http://schemas.microsoft.com/office/drawing/2016/5/9/chartex" xmlns:cx4="http://schemas.microsoft.com/office/drawing/2016/5/10/chartex" xmlns:cx5="http://schemas.microsoft.com/office/drawing/2016/5/11/chartex" xmlns:cx6="http://schemas.microsoft.com/office/drawing/2016/5/12/chartex" xmlns:cx7="http://schemas.microsoft.com/office/drawing/2016/5/13/chartex" xmlns:cx8="http://schemas.microsoft.com/office/drawing/2016/5/14/chartex" xmlns:mc="http://schemas.openxmlformats.org/markup-compatibility/2006" xmlns:aink="http://schemas.microsoft.com/office/drawing/2016/ink" xmlns:am3d="http://schemas.microsoft.com/office/drawing/2017/model3d" xmlns:o="urn:schemas-microsoft-com:office:office" xmlns:oel="http://schemas.microsoft.com/office/2019/extlst" xmlns:r="http://schemas.openxmlformats.org/officeDocument/2006/relationships" xmlns:m="http://schemas.openxmlformats.org/officeDocument/2006/math" xmlns:v="urn:schemas-microsoft-com:vml" xmlns:wp14="http://schemas.microsoft.com/office/word/2010/wordprocessingDrawing" xmlns:wp="http://schemas.openxmlformats.org/drawingml/2006/wordprocessingDrawing" xmlns:w10="urn:schemas-microsoft-com:office:word" xmlns:w="http://schemas.openxmlformats.org/wordprocessingml/2006/main" xmlns:w14="http://schemas.microsoft.com/office/word/2010/wordml" xmlns:w15="http://schemas.microsoft.com/office/word/2012/wordml" xmlns:w16cex="http://schemas.microsoft.com/office/word/2018/wordml/cex" xmlns:w16cid="http://schemas.microsoft.com/office/word/2016/wordml/cid" xmlns:w16="http://schemas.microsoft.com/office/word/2018/wordml" xmlns:w16du="http://schemas.microsoft.com/office/word/2023/wordml/word16du" xmlns:w16sdtdh="http://schemas.microsoft.com/office/word/2020/wordml/sdtdatahash" xmlns:w16sdtfl="http://schemas.microsoft.com/office/word/2024/wordml/sdtformatlock" xmlns:w16se="http://schemas.microsoft.com/office/word/2015/wordml/symex" xmlns:wpg="http://schemas.microsoft.com/office/word/2010/wordprocessingGroup" xmlns:wpi="http://schemas.microsoft.com/office/word/2010/wordprocessingInk" xmlns:wne="http://schemas.microsoft.com/office/word/2006/wordml" xmlns:wps="http://schemas.microsoft.com/office/word/2010/wordprocessingShape" mc:Ignorable="w14 w15 w16se w16cid w16 w16cex w16sdtdh w16sdtfl w16du wp14">
+<w:document xmlns:wpc="http://schemas.microsoft.com/office/word/2010/wordprocessingCanvas" xmlns:cx="http://schemas.microsoft.com/office/drawing/2014/chartex" xmlns:cx1="http://schemas.microsoft.com/office/drawing/2015/9/8/chartex" xmlns:cx2="http://schemas.microsoft.com/office/drawing/2015/10/21/chartex" xmlns:cx3="http://schemas.microsoft.com/office/drawing/2016/5/9/chartex" xmlns:cx4="http://schemas.microsoft.com/office/drawing/2016/5/10/chartex" xmlns:cx5="http://schemas.microsoft.com/office/drawing/2016/5/11/chartex" xmlns:cx6="http://schemas.microsoft.com/office/drawing/2016/5/12/chartex" xmlns:cx7="http://schemas.microsoft.com/office/drawing/2016/5/13/chartex" xmlns:cx8="http://schemas.microsoft.com/office/drawing/2016/5/14/chartex" xmlns:mc="http://schemas.openxmlformats.org/markup-compatibility/2006" xmlns:aink="http://schemas.microsoft.com/office/drawing/2016/ink" xmlns:am3d="http://schemas.microsoft.com/office/drawing/2017/model3d" xmlns:o="urn:schemas-microsoft-com:office:office" xmlns:oel="http://schemas.microsoft.com/office/2019/extlst" xmlns:r="http://schemas.openxmlformats.org/officeDocument/2006/relationships" xmlns:m="http://schemas.openxmlformats.org/officeDocument/2006/math" xmlns:v="urn:schemas-microsoft-com:vml" xmlns:wp14="http://schemas.microsoft.com/office/word/2010/wordprocessingDrawing" xmlns:wp="http://schemas.openxmlformats.org/drawingml/2006/wordprocessingDrawing" xmlns:w10="urn:schemas-microsoft-com:office:word" xmlns:w="http://schemas.openxmlformats.org/wordprocessingml/2006/main" xmlns:w14="http://schemas.microsoft.com/office/word/2010/wordml" xmlns:w15="http://schemas.microsoft.com/office/word/2012/wordml" xmlns:w16cex="http://schemas.microsoft.com/office/word/2018/wordml/cex" xmlns:w16cid="http://schemas.microsoft.com/office/word/2016/wordml/cid" xmlns:w16="http://schemas.microsoft.com/office/word/2018/wordml" xmlns:w16sdtdh="http://schemas.microsoft.com/office/word/2020/wordml/sdtdatahash" xmlns:w16se="http://schemas.microsoft.com/office/word/2015/wordml/symex" xmlns:wpg="http://schemas.microsoft.com/office/word/2010/wordprocessingGroup" xmlns:wpi="http://schemas.microsoft.com/office/word/2010/wordprocessingInk" xmlns:wne="http://schemas.microsoft.com/office/word/2006/wordml" xmlns:wps="http://schemas.microsoft.com/office/word/2010/wordprocessingShape" mc:Ignorable="w14 w15 w16se w16cid w16 w16cex w16sdtdh wp14">
   <w:body>
     <w:p>
       <w:pPr>
@@ -270,7 +270,7 @@
               </wp:anchor>
             </w:drawing>
           </mc:Choice>
-          <mc:Fallback>
+          <mc:Fallback xmlns:w16sdtfl="http://schemas.microsoft.com/office/word/2024/wordml/sdtformatlock" xmlns:w16du="http://schemas.microsoft.com/office/word/2023/wordml/word16du">
             <w:pict>
               <v:shapetype w14:anchorId="31BDEDF3" id="_x0000_t202" coordsize="21600,21600" o:spt="202" path="m,l,21600r21600,l21600,xe">
                 <v:stroke joinstyle="miter"/>
@@ -633,7 +633,7 @@
               </wp:anchor>
             </w:drawing>
           </mc:Choice>
-          <mc:Fallback>
+          <mc:Fallback xmlns:w16sdtfl="http://schemas.microsoft.com/office/word/2024/wordml/sdtformatlock" xmlns:w16du="http://schemas.microsoft.com/office/word/2023/wordml/word16du">
             <w:pict>
               <v:shape w14:anchorId="6466823C" id="Text Box 2" o:spid="_x0000_s1027" type="#_x0000_t202" style="position:absolute;margin-left:40.3pt;margin-top:4.65pt;width:545.45pt;height:87.55pt;z-index:251679744;visibility:visible;mso-wrap-style:square;mso-width-percent:0;mso-height-percent:0;mso-wrap-distance-left:9pt;mso-wrap-distance-top:7.2pt;mso-wrap-distance-right:9pt;mso-wrap-distance-bottom:7.2pt;mso-position-horizontal:absolute;mso-position-horizontal-relative:page;mso-position-vertical:absolute;mso-position-vertical-relative:text;mso-width-percent:0;mso-height-percent:0;mso-width-relative:margin;mso-height-relative:margin;v-text-anchor:top" o:gfxdata="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" filled="f" stroked="f">
                 <v:textbox>
@@ -1171,7 +1171,7 @@
                   </wp:anchor>
                 </w:drawing>
               </mc:Choice>
-              <mc:Fallback>
+              <mc:Fallback xmlns:w16sdtfl="http://schemas.microsoft.com/office/word/2024/wordml/sdtformatlock" xmlns:w16du="http://schemas.microsoft.com/office/word/2023/wordml/word16du">
                 <w:pict>
                   <v:group w14:anchorId="31857F9A" id="Group 198" o:spid="_x0000_s1028" style="position:absolute;margin-left:-102.3pt;margin-top:353.3pt;width:518.25pt;height:309pt;z-index:251677696;mso-wrap-distance-left:14.4pt;mso-wrap-distance-top:3.6pt;mso-wrap-distance-right:14.4pt;mso-wrap-distance-bottom:3.6pt;mso-position-horizontal-relative:margin;mso-position-vertical-relative:margin;mso-width-relative:margin;mso-height-relative:margin" coordorigin=",228" coordsize="35784,21895" o:gfxdata="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">
                     <v:rect id="Rectangle 199" o:spid="_x0000_s1029" style="position:absolute;top:228;width:35674;height:2448;visibility:visible;mso-wrap-style:square;v-text-anchor:middle" o:gfxdata="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" fillcolor="#fc6" stroked="f" strokeweight="2pt">
@@ -1638,6 +1638,15 @@
                                         </w:rPr>
                                         <w:t xml:space="preserve">Name: </w:t>
                                       </w:r>
+                                      <w:r>
+                                        <w:rPr>
+                                          <w:rFonts w:ascii="Times New Roman" w:hAnsi="Times New Roman" w:cs="Times New Roman"/>
+                                          <w:color w:val="996633"/>
+                                          <w:sz w:val="32"/>
+                                          <w:szCs w:val="32"/>
+                                        </w:rPr>
+                                        <w:t>Bradley Moore</w:t>
+                                      </w:r>
                                     </w:p>
                                     <w:p>
                                       <w:pPr>
@@ -1668,6 +1677,15 @@
                                           <w:szCs w:val="32"/>
                                         </w:rPr>
                                         <w:t xml:space="preserve">CRN: </w:t>
+                                      </w:r>
+                                      <w:r>
+                                        <w:rPr>
+                                          <w:rFonts w:ascii="Times New Roman" w:hAnsi="Times New Roman" w:cs="Times New Roman"/>
+                                          <w:color w:val="996633"/>
+                                          <w:sz w:val="32"/>
+                                          <w:szCs w:val="32"/>
+                                        </w:rPr>
+                                        <w:t>CSC 575</w:t>
                                       </w:r>
                                     </w:p>
                                   </w:tc>
@@ -1715,6 +1733,15 @@
                                           <w:szCs w:val="32"/>
                                         </w:rPr>
                                         <w:t xml:space="preserve">ID: </w:t>
+                                      </w:r>
+                                      <w:r>
+                                        <w:rPr>
+                                          <w:rFonts w:ascii="Times New Roman" w:hAnsi="Times New Roman" w:cs="Times New Roman"/>
+                                          <w:color w:val="996633"/>
+                                          <w:sz w:val="32"/>
+                                          <w:szCs w:val="32"/>
+                                        </w:rPr>
+                                        <w:t>35737785</w:t>
                                       </w:r>
                                     </w:p>
                                     <w:p>
@@ -1797,7 +1824,11 @@
               </mc:Choice>
               <mc:Fallback>
                 <w:pict>
-                  <v:shape w14:anchorId="7CBAAF0B" id="Text Box 15" o:spid="_x0000_s1031" type="#_x0000_t202" alt="contact info" style="position:absolute;margin-left:36.25pt;margin-top:253.85pt;width:540pt;height:92.7pt;z-index:251675648;visibility:visible;mso-wrap-style:square;mso-width-percent:1282;mso-height-percent:0;mso-wrap-distance-left:9pt;mso-wrap-distance-top:0;mso-wrap-distance-right:9pt;mso-wrap-distance-bottom:0;mso-position-horizontal:absolute;mso-position-horizontal-relative:page;mso-position-vertical:absolute;mso-position-vertical-relative:margin;mso-width-percent:1282;mso-height-percent:0;mso-width-relative:margin;mso-height-relative:margin;v-text-anchor:bottom" o:gfxdata="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" o:allowoverlap="f" filled="f" stroked="f" strokeweight=".5pt">
+                  <v:shapetype w14:anchorId="7CBAAF0B" id="_x0000_t202" coordsize="21600,21600" o:spt="202" path="m,l,21600r21600,l21600,xe">
+                    <v:stroke joinstyle="miter"/>
+                    <v:path gradientshapeok="t" o:connecttype="rect"/>
+                  </v:shapetype>
+                  <v:shape id="Text Box 15" o:spid="_x0000_s1031" type="#_x0000_t202" alt="contact info" style="position:absolute;margin-left:36.25pt;margin-top:253.85pt;width:540pt;height:92.7pt;z-index:251675648;visibility:visible;mso-wrap-style:square;mso-width-percent:1282;mso-height-percent:0;mso-wrap-distance-left:9pt;mso-wrap-distance-top:0;mso-wrap-distance-right:9pt;mso-wrap-distance-bottom:0;mso-position-horizontal:absolute;mso-position-horizontal-relative:page;mso-position-vertical:absolute;mso-position-vertical-relative:margin;mso-width-percent:1282;mso-height-percent:0;mso-width-relative:margin;mso-height-relative:margin;v-text-anchor:bottom" o:gfxdata="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" o:allowoverlap="f" filled="f" stroked="f" strokeweight=".5pt">
                     <v:textbox inset="0,0,0,0">
                       <w:txbxContent>
                         <w:p>
@@ -1907,6 +1938,15 @@
                                   </w:rPr>
                                   <w:t xml:space="preserve">Name: </w:t>
                                 </w:r>
+                                <w:r>
+                                  <w:rPr>
+                                    <w:rFonts w:ascii="Times New Roman" w:hAnsi="Times New Roman" w:cs="Times New Roman"/>
+                                    <w:color w:val="996633"/>
+                                    <w:sz w:val="32"/>
+                                    <w:szCs w:val="32"/>
+                                  </w:rPr>
+                                  <w:t>Bradley Moore</w:t>
+                                </w:r>
                               </w:p>
                               <w:p>
                                 <w:pPr>
@@ -1937,6 +1977,15 @@
                                     <w:szCs w:val="32"/>
                                   </w:rPr>
                                   <w:t xml:space="preserve">CRN: </w:t>
+                                </w:r>
+                                <w:r>
+                                  <w:rPr>
+                                    <w:rFonts w:ascii="Times New Roman" w:hAnsi="Times New Roman" w:cs="Times New Roman"/>
+                                    <w:color w:val="996633"/>
+                                    <w:sz w:val="32"/>
+                                    <w:szCs w:val="32"/>
+                                  </w:rPr>
+                                  <w:t>CSC 575</w:t>
                                 </w:r>
                               </w:p>
                             </w:tc>
@@ -1984,6 +2033,15 @@
                                     <w:szCs w:val="32"/>
                                   </w:rPr>
                                   <w:t xml:space="preserve">ID: </w:t>
+                                </w:r>
+                                <w:r>
+                                  <w:rPr>
+                                    <w:rFonts w:ascii="Times New Roman" w:hAnsi="Times New Roman" w:cs="Times New Roman"/>
+                                    <w:color w:val="996633"/>
+                                    <w:sz w:val="32"/>
+                                    <w:szCs w:val="32"/>
+                                  </w:rPr>
+                                  <w:t>35737785</w:t>
                                 </w:r>
                               </w:p>
                               <w:p>
@@ -2179,7 +2237,7 @@
               </wp:anchor>
             </w:drawing>
           </mc:Choice>
-          <mc:Fallback>
+          <mc:Fallback xmlns:w16sdtfl="http://schemas.microsoft.com/office/word/2024/wordml/sdtformatlock" xmlns:w16du="http://schemas.microsoft.com/office/word/2023/wordml/word16du">
             <w:pict>
               <v:shapetype w14:anchorId="6E4FD12B" id="_x0000_t185" coordsize="21600,21600" o:spt="185" adj="3600" path="m@0,nfqx0@0l0@2qy@0,21600em@1,nfqx21600@0l21600@2qy@1,21600em@0,nsqx0@0l0@2qy@0,21600l@1,21600qx21600@2l21600@0qy@1,xe" filled="f">
                 <v:formulas>
@@ -2284,27 +2342,7 @@
           <w:sz w:val="24"/>
           <w:szCs w:val="24"/>
         </w:rPr>
-        <w:t xml:space="preserve">Write a java program that reads a </w:t>
-      </w:r>
-      <w:proofErr w:type="gramStart"/>
-      <w:r>
-        <w:rPr>
-          <w:rFonts w:ascii="Times New Roman" w:hAnsi="Times New Roman" w:cs="Times New Roman"/>
-          <w:color w:val="231F20"/>
-          <w:sz w:val="24"/>
-          <w:szCs w:val="24"/>
-        </w:rPr>
-        <w:t>string, and</w:t>
-      </w:r>
-      <w:proofErr w:type="gramEnd"/>
-      <w:r>
-        <w:rPr>
-          <w:rFonts w:ascii="Times New Roman" w:hAnsi="Times New Roman" w:cs="Times New Roman"/>
-          <w:color w:val="231F20"/>
-          <w:sz w:val="24"/>
-          <w:szCs w:val="24"/>
-        </w:rPr>
-        <w:t xml:space="preserve"> then prints a message saying whether it is a palindrome in recursively way. A palindrome is a string that is the same forward and backward. For example, [Mom] is a Palindrome.</w:t>
+        <w:t>Write a java program that reads a string, and then prints a message saying whether it is a palindrome in recursively way. A palindrome is a string that is the same forward and backward. For example, [Mom] is a Palindrome.</w:t>
       </w:r>
     </w:p>
     <w:p>
@@ -2396,19 +2434,8 @@
           <w:szCs w:val="24"/>
         </w:rPr>
         <w:tab/>
-        <w:t xml:space="preserve">A string containing 2 or more letters is a palindrome </w:t>
+        <w:t>A string containing 2 or more letters is a palindrome if :</w:t>
       </w:r>
-      <w:proofErr w:type="gramStart"/>
-      <w:r>
-        <w:rPr>
-          <w:rFonts w:ascii="Times New Roman" w:hAnsi="Times New Roman" w:cs="Times New Roman"/>
-          <w:color w:val="231F20"/>
-          <w:sz w:val="24"/>
-          <w:szCs w:val="24"/>
-        </w:rPr>
-        <w:t>if :</w:t>
-      </w:r>
-      <w:proofErr w:type="gramEnd"/>
     </w:p>
     <w:p>
       <w:pPr>
@@ -2516,8 +2543,6 @@
           <w:szCs w:val="24"/>
         </w:rPr>
       </w:pPr>
-      <w:proofErr w:type="spellStart"/>
-      <w:proofErr w:type="gramStart"/>
       <w:r>
         <w:rPr>
           <w:rFonts w:ascii="Times New Roman" w:hAnsi="Times New Roman" w:cs="Times New Roman"/>
@@ -2525,40 +2550,7 @@
           <w:sz w:val="24"/>
           <w:szCs w:val="24"/>
         </w:rPr>
-        <w:t>s.length</w:t>
-      </w:r>
-      <w:proofErr w:type="spellEnd"/>
-      <w:proofErr w:type="gramEnd"/>
-      <w:r>
-        <w:rPr>
-          <w:rFonts w:ascii="Times New Roman" w:hAnsi="Times New Roman" w:cs="Times New Roman"/>
-          <w:color w:val="231F20"/>
-          <w:sz w:val="24"/>
-          <w:szCs w:val="24"/>
-        </w:rPr>
-        <w:t xml:space="preserve">() returns the number of characters in s. For example: if s="happy" Then: </w:t>
-      </w:r>
-      <w:proofErr w:type="spellStart"/>
-      <w:proofErr w:type="gramStart"/>
-      <w:r>
-        <w:rPr>
-          <w:rFonts w:ascii="Times New Roman" w:hAnsi="Times New Roman" w:cs="Times New Roman"/>
-          <w:color w:val="231F20"/>
-          <w:sz w:val="24"/>
-          <w:szCs w:val="24"/>
-        </w:rPr>
-        <w:t>s.length</w:t>
-      </w:r>
-      <w:proofErr w:type="spellEnd"/>
-      <w:proofErr w:type="gramEnd"/>
-      <w:r>
-        <w:rPr>
-          <w:rFonts w:ascii="Times New Roman" w:hAnsi="Times New Roman" w:cs="Times New Roman"/>
-          <w:color w:val="231F20"/>
-          <w:sz w:val="24"/>
-          <w:szCs w:val="24"/>
-        </w:rPr>
-        <w:t xml:space="preserve"> = 5</w:t>
+        <w:t>s.length() returns the number of characters in s. For example: if s="happy" Then: s.length = 5</w:t>
       </w:r>
     </w:p>
     <w:p>
@@ -2575,8 +2567,6 @@
           <w:szCs w:val="24"/>
         </w:rPr>
       </w:pPr>
-      <w:proofErr w:type="spellStart"/>
-      <w:proofErr w:type="gramStart"/>
       <w:r>
         <w:rPr>
           <w:rFonts w:ascii="Times New Roman" w:hAnsi="Times New Roman" w:cs="Times New Roman"/>
@@ -2584,80 +2574,7 @@
           <w:sz w:val="24"/>
           <w:szCs w:val="24"/>
         </w:rPr>
-        <w:t>s.charAt</w:t>
-      </w:r>
-      <w:proofErr w:type="spellEnd"/>
-      <w:proofErr w:type="gramEnd"/>
-      <w:r>
-        <w:rPr>
-          <w:rFonts w:ascii="Times New Roman" w:hAnsi="Times New Roman" w:cs="Times New Roman"/>
-          <w:color w:val="231F20"/>
-          <w:sz w:val="24"/>
-          <w:szCs w:val="24"/>
-        </w:rPr>
-        <w:t>(</w:t>
-      </w:r>
-      <w:proofErr w:type="spellStart"/>
-      <w:r>
-        <w:rPr>
-          <w:rFonts w:ascii="Times New Roman" w:hAnsi="Times New Roman" w:cs="Times New Roman"/>
-          <w:color w:val="231F20"/>
-          <w:sz w:val="24"/>
-          <w:szCs w:val="24"/>
-        </w:rPr>
-        <w:t>i</w:t>
-      </w:r>
-      <w:proofErr w:type="spellEnd"/>
-      <w:r>
-        <w:rPr>
-          <w:rFonts w:ascii="Times New Roman" w:hAnsi="Times New Roman" w:cs="Times New Roman"/>
-          <w:color w:val="231F20"/>
-          <w:sz w:val="24"/>
-          <w:szCs w:val="24"/>
-        </w:rPr>
-        <w:t xml:space="preserve">) returns the </w:t>
-      </w:r>
-      <w:proofErr w:type="spellStart"/>
-      <w:r>
-        <w:rPr>
-          <w:rFonts w:ascii="Times New Roman" w:hAnsi="Times New Roman" w:cs="Times New Roman"/>
-          <w:color w:val="231F20"/>
-          <w:sz w:val="24"/>
-          <w:szCs w:val="24"/>
-        </w:rPr>
-        <w:t>ith</w:t>
-      </w:r>
-      <w:proofErr w:type="spellEnd"/>
-      <w:r>
-        <w:rPr>
-          <w:rFonts w:ascii="Times New Roman" w:hAnsi="Times New Roman" w:cs="Times New Roman"/>
-          <w:color w:val="231F20"/>
-          <w:sz w:val="24"/>
-          <w:szCs w:val="24"/>
-        </w:rPr>
-        <w:t xml:space="preserve"> character of s, 0-based. For example: if s="happy" Then: </w:t>
-      </w:r>
-      <w:proofErr w:type="spellStart"/>
-      <w:proofErr w:type="gramStart"/>
-      <w:r>
-        <w:rPr>
-          <w:rFonts w:ascii="Times New Roman" w:hAnsi="Times New Roman" w:cs="Times New Roman"/>
-          <w:color w:val="231F20"/>
-          <w:sz w:val="24"/>
-          <w:szCs w:val="24"/>
-        </w:rPr>
-        <w:t>s.charAt</w:t>
-      </w:r>
-      <w:proofErr w:type="spellEnd"/>
-      <w:proofErr w:type="gramEnd"/>
-      <w:r>
-        <w:rPr>
-          <w:rFonts w:ascii="Times New Roman" w:hAnsi="Times New Roman" w:cs="Times New Roman"/>
-          <w:color w:val="231F20"/>
-          <w:sz w:val="24"/>
-          <w:szCs w:val="24"/>
-        </w:rPr>
-        <w:t>(1) equals 'a'</w:t>
+        <w:t>s.charAt(i) returns the ith character of s, 0-based. For example: if s="happy" Then: s.charAt(1) equals 'a'</w:t>
       </w:r>
     </w:p>
     <w:p>
@@ -2816,38 +2733,7 @@
           <w:sz w:val="24"/>
           <w:szCs w:val="24"/>
         </w:rPr>
-        <w:t xml:space="preserve">Step 5: Call the function </w:t>
-      </w:r>
-      <w:proofErr w:type="spellStart"/>
-      <w:proofErr w:type="gramStart"/>
-      <w:r>
-        <w:rPr>
-          <w:rFonts w:ascii="Times New Roman" w:hAnsi="Times New Roman" w:cs="Times New Roman"/>
-          <w:color w:val="231F20"/>
-          <w:sz w:val="24"/>
-          <w:szCs w:val="24"/>
-        </w:rPr>
-        <w:t>isPalendrome</w:t>
-      </w:r>
-      <w:proofErr w:type="spellEnd"/>
-      <w:r>
-        <w:rPr>
-          <w:rFonts w:ascii="Times New Roman" w:hAnsi="Times New Roman" w:cs="Times New Roman"/>
-          <w:color w:val="231F20"/>
-          <w:sz w:val="24"/>
-          <w:szCs w:val="24"/>
-        </w:rPr>
-        <w:t>(</w:t>
-      </w:r>
-      <w:proofErr w:type="gramEnd"/>
-      <w:r>
-        <w:rPr>
-          <w:rFonts w:ascii="Times New Roman" w:hAnsi="Times New Roman" w:cs="Times New Roman"/>
-          <w:color w:val="231F20"/>
-          <w:sz w:val="24"/>
-          <w:szCs w:val="24"/>
-        </w:rPr>
-        <w:t xml:space="preserve">) to Check if the text is a Palindrome. </w:t>
+        <w:t xml:space="preserve">Step 5: Call the function isPalendrome() to Check if the text is a Palindrome. </w:t>
       </w:r>
     </w:p>
     <w:p>
@@ -2871,17 +2757,7 @@
           <w:sz w:val="24"/>
           <w:szCs w:val="24"/>
         </w:rPr>
-        <w:t xml:space="preserve">Step 6: Print the </w:t>
-      </w:r>
-      <w:proofErr w:type="spellStart"/>
-      <w:r>
-        <w:rPr>
-          <w:rFonts w:ascii="Times New Roman" w:hAnsi="Times New Roman" w:cs="Times New Roman"/>
-          <w:color w:val="231F20"/>
-          <w:sz w:val="24"/>
-          <w:szCs w:val="24"/>
-        </w:rPr>
-        <w:t>t</w:t>
+        <w:t>Step 6: Print the t</w:t>
       </w:r>
       <w:r>
         <w:rPr>
@@ -2892,7 +2768,6 @@
         </w:rPr>
         <w:t>he</w:t>
       </w:r>
-      <w:proofErr w:type="spellEnd"/>
       <w:r>
         <w:rPr>
           <w:rFonts w:ascii="Times New Roman" w:hAnsi="Times New Roman" w:cs="Times New Roman"/>
@@ -2933,13 +2808,1154 @@
         </w:rPr>
       </w:pPr>
     </w:p>
-    <w:bookmarkEnd w:id="1"/>
     <w:p>
       <w:pPr>
         <w:autoSpaceDE w:val="0"/>
         <w:autoSpaceDN w:val="0"/>
         <w:adjustRightInd w:val="0"/>
         <w:spacing w:after="0" w:line="240" w:lineRule="auto"/>
+        <w:jc w:val="both"/>
+        <w:rPr>
+          <w:rFonts w:ascii="Times New Roman" w:hAnsi="Times New Roman" w:cs="Times New Roman"/>
+          <w:color w:val="231F20"/>
+          <w:sz w:val="24"/>
+          <w:szCs w:val="24"/>
+        </w:rPr>
+      </w:pPr>
+    </w:p>
+    <w:p>
+      <w:pPr>
+        <w:autoSpaceDE w:val="0"/>
+        <w:autoSpaceDN w:val="0"/>
+        <w:adjustRightInd w:val="0"/>
+        <w:spacing w:after="0" w:line="240" w:lineRule="auto"/>
+        <w:jc w:val="both"/>
+        <w:rPr>
+          <w:rFonts w:ascii="Times New Roman" w:hAnsi="Times New Roman" w:cs="Times New Roman"/>
+          <w:color w:val="231F20"/>
+          <w:sz w:val="24"/>
+          <w:szCs w:val="24"/>
+        </w:rPr>
+      </w:pPr>
+    </w:p>
+    <w:p>
+      <w:pPr>
+        <w:autoSpaceDE w:val="0"/>
+        <w:autoSpaceDN w:val="0"/>
+        <w:adjustRightInd w:val="0"/>
+        <w:spacing w:after="0" w:line="240" w:lineRule="auto"/>
+        <w:jc w:val="both"/>
+        <w:rPr>
+          <w:rFonts w:ascii="Times New Roman" w:hAnsi="Times New Roman" w:cs="Times New Roman"/>
+          <w:color w:val="231F20"/>
+          <w:sz w:val="24"/>
+          <w:szCs w:val="24"/>
+        </w:rPr>
+      </w:pPr>
+    </w:p>
+    <w:p>
+      <w:pPr>
+        <w:autoSpaceDE w:val="0"/>
+        <w:autoSpaceDN w:val="0"/>
+        <w:adjustRightInd w:val="0"/>
+        <w:spacing w:after="0" w:line="240" w:lineRule="auto"/>
+        <w:jc w:val="both"/>
+        <w:rPr>
+          <w:rFonts w:ascii="Times New Roman" w:hAnsi="Times New Roman" w:cs="Times New Roman"/>
+          <w:color w:val="231F20"/>
+          <w:sz w:val="24"/>
+          <w:szCs w:val="24"/>
+        </w:rPr>
+      </w:pPr>
+    </w:p>
+    <w:p>
+      <w:pPr>
+        <w:autoSpaceDE w:val="0"/>
+        <w:autoSpaceDN w:val="0"/>
+        <w:adjustRightInd w:val="0"/>
+        <w:spacing w:after="0" w:line="240" w:lineRule="auto"/>
+        <w:jc w:val="both"/>
+        <w:rPr>
+          <w:rFonts w:ascii="Times New Roman" w:hAnsi="Times New Roman" w:cs="Times New Roman"/>
+          <w:color w:val="231F20"/>
+          <w:sz w:val="24"/>
+          <w:szCs w:val="24"/>
+        </w:rPr>
+      </w:pPr>
+    </w:p>
+    <w:p>
+      <w:pPr>
+        <w:autoSpaceDE w:val="0"/>
+        <w:autoSpaceDN w:val="0"/>
+        <w:adjustRightInd w:val="0"/>
+        <w:spacing w:after="0" w:line="240" w:lineRule="auto"/>
+        <w:jc w:val="both"/>
+        <w:rPr>
+          <w:rFonts w:ascii="Times New Roman" w:hAnsi="Times New Roman" w:cs="Times New Roman"/>
+          <w:color w:val="231F20"/>
+          <w:sz w:val="24"/>
+          <w:szCs w:val="24"/>
+        </w:rPr>
+      </w:pPr>
+    </w:p>
+    <w:p>
+      <w:pPr>
+        <w:autoSpaceDE w:val="0"/>
+        <w:autoSpaceDN w:val="0"/>
+        <w:adjustRightInd w:val="0"/>
+        <w:spacing w:after="0" w:line="240" w:lineRule="auto"/>
+        <w:jc w:val="both"/>
+        <w:rPr>
+          <w:rFonts w:ascii="Times New Roman" w:hAnsi="Times New Roman" w:cs="Times New Roman"/>
+          <w:color w:val="231F20"/>
+          <w:sz w:val="24"/>
+          <w:szCs w:val="24"/>
+        </w:rPr>
+      </w:pPr>
+    </w:p>
+    <w:p>
+      <w:pPr>
+        <w:autoSpaceDE w:val="0"/>
+        <w:autoSpaceDN w:val="0"/>
+        <w:adjustRightInd w:val="0"/>
+        <w:spacing w:after="0" w:line="240" w:lineRule="auto"/>
+        <w:jc w:val="both"/>
+        <w:rPr>
+          <w:rFonts w:ascii="Times New Roman" w:hAnsi="Times New Roman" w:cs="Times New Roman"/>
+          <w:color w:val="231F20"/>
+          <w:sz w:val="24"/>
+          <w:szCs w:val="24"/>
+        </w:rPr>
+      </w:pPr>
+    </w:p>
+    <w:p>
+      <w:pPr>
+        <w:autoSpaceDE w:val="0"/>
+        <w:autoSpaceDN w:val="0"/>
+        <w:adjustRightInd w:val="0"/>
+        <w:spacing w:after="0" w:line="240" w:lineRule="auto"/>
+        <w:jc w:val="both"/>
+        <w:rPr>
+          <w:rFonts w:ascii="Times New Roman" w:hAnsi="Times New Roman" w:cs="Times New Roman"/>
+          <w:color w:val="231F20"/>
+          <w:sz w:val="24"/>
+          <w:szCs w:val="24"/>
+        </w:rPr>
+      </w:pPr>
+    </w:p>
+    <w:p>
+      <w:pPr>
+        <w:autoSpaceDE w:val="0"/>
+        <w:autoSpaceDN w:val="0"/>
+        <w:adjustRightInd w:val="0"/>
+        <w:spacing w:after="0" w:line="240" w:lineRule="auto"/>
+        <w:jc w:val="both"/>
+        <w:rPr>
+          <w:rFonts w:ascii="Times New Roman" w:hAnsi="Times New Roman" w:cs="Times New Roman"/>
+          <w:color w:val="231F20"/>
+          <w:sz w:val="24"/>
+          <w:szCs w:val="24"/>
+        </w:rPr>
+      </w:pPr>
+    </w:p>
+    <w:p>
+      <w:pPr>
+        <w:autoSpaceDE w:val="0"/>
+        <w:autoSpaceDN w:val="0"/>
+        <w:adjustRightInd w:val="0"/>
+        <w:spacing w:after="0" w:line="240" w:lineRule="auto"/>
+        <w:jc w:val="both"/>
+        <w:rPr>
+          <w:rFonts w:ascii="Times New Roman" w:hAnsi="Times New Roman" w:cs="Times New Roman"/>
+          <w:color w:val="231F20"/>
+          <w:sz w:val="24"/>
+          <w:szCs w:val="24"/>
+        </w:rPr>
+      </w:pPr>
+    </w:p>
+    <w:p>
+      <w:pPr>
+        <w:autoSpaceDE w:val="0"/>
+        <w:autoSpaceDN w:val="0"/>
+        <w:adjustRightInd w:val="0"/>
+        <w:spacing w:after="0" w:line="240" w:lineRule="auto"/>
+        <w:jc w:val="both"/>
+        <w:rPr>
+          <w:rFonts w:ascii="Times New Roman" w:hAnsi="Times New Roman" w:cs="Times New Roman"/>
+          <w:color w:val="231F20"/>
+          <w:sz w:val="24"/>
+          <w:szCs w:val="24"/>
+        </w:rPr>
+      </w:pPr>
+    </w:p>
+    <w:p>
+      <w:pPr>
+        <w:autoSpaceDE w:val="0"/>
+        <w:autoSpaceDN w:val="0"/>
+        <w:adjustRightInd w:val="0"/>
+        <w:spacing w:after="0" w:line="240" w:lineRule="auto"/>
+        <w:jc w:val="both"/>
+        <w:rPr>
+          <w:rFonts w:ascii="Times New Roman" w:hAnsi="Times New Roman" w:cs="Times New Roman"/>
+          <w:color w:val="231F20"/>
+          <w:sz w:val="24"/>
+          <w:szCs w:val="24"/>
+        </w:rPr>
+      </w:pPr>
+      <w:r>
+        <w:rPr>
+          <w:rFonts w:ascii="Times New Roman" w:hAnsi="Times New Roman" w:cs="Times New Roman"/>
+          <w:color w:val="231F20"/>
+          <w:sz w:val="24"/>
+          <w:szCs w:val="24"/>
+        </w:rPr>
+        <w:lastRenderedPageBreak/>
+        <w:t>import java.util.Scanner;</w:t>
+      </w:r>
+    </w:p>
+    <w:p>
+      <w:pPr>
+        <w:autoSpaceDE w:val="0"/>
+        <w:autoSpaceDN w:val="0"/>
+        <w:adjustRightInd w:val="0"/>
+        <w:spacing w:after="0" w:line="240" w:lineRule="auto"/>
+        <w:jc w:val="both"/>
+        <w:rPr>
+          <w:rFonts w:ascii="Times New Roman" w:hAnsi="Times New Roman" w:cs="Times New Roman"/>
+          <w:color w:val="231F20"/>
+          <w:sz w:val="24"/>
+          <w:szCs w:val="24"/>
+        </w:rPr>
+      </w:pPr>
+    </w:p>
+    <w:p>
+      <w:pPr>
+        <w:autoSpaceDE w:val="0"/>
+        <w:autoSpaceDN w:val="0"/>
+        <w:adjustRightInd w:val="0"/>
+        <w:spacing w:after="0" w:line="240" w:lineRule="auto"/>
+        <w:jc w:val="both"/>
+        <w:rPr>
+          <w:rFonts w:ascii="Times New Roman" w:hAnsi="Times New Roman" w:cs="Times New Roman"/>
+          <w:color w:val="231F20"/>
+          <w:sz w:val="24"/>
+          <w:szCs w:val="24"/>
+        </w:rPr>
+      </w:pPr>
+      <w:r>
+        <w:rPr>
+          <w:rFonts w:ascii="Times New Roman" w:hAnsi="Times New Roman" w:cs="Times New Roman"/>
+          <w:color w:val="231F20"/>
+          <w:sz w:val="24"/>
+          <w:szCs w:val="24"/>
+        </w:rPr>
+        <w:t>public class PalindromeChecker{</w:t>
+      </w:r>
+    </w:p>
+    <w:p>
+      <w:pPr>
+        <w:autoSpaceDE w:val="0"/>
+        <w:autoSpaceDN w:val="0"/>
+        <w:adjustRightInd w:val="0"/>
+        <w:spacing w:after="0" w:line="240" w:lineRule="auto"/>
+        <w:jc w:val="both"/>
+        <w:rPr>
+          <w:rFonts w:ascii="Times New Roman" w:hAnsi="Times New Roman" w:cs="Times New Roman"/>
+          <w:color w:val="231F20"/>
+          <w:sz w:val="24"/>
+          <w:szCs w:val="24"/>
+        </w:rPr>
+      </w:pPr>
+      <w:r>
+        <w:rPr>
+          <w:rFonts w:ascii="Times New Roman" w:hAnsi="Times New Roman" w:cs="Times New Roman"/>
+          <w:color w:val="231F20"/>
+          <w:sz w:val="24"/>
+          <w:szCs w:val="24"/>
+        </w:rPr>
+        <w:t xml:space="preserve">    </w:t>
+      </w:r>
+    </w:p>
+    <w:p>
+      <w:pPr>
+        <w:autoSpaceDE w:val="0"/>
+        <w:autoSpaceDN w:val="0"/>
+        <w:adjustRightInd w:val="0"/>
+        <w:spacing w:after="0" w:line="240" w:lineRule="auto"/>
+        <w:jc w:val="both"/>
+        <w:rPr>
+          <w:rFonts w:ascii="Times New Roman" w:hAnsi="Times New Roman" w:cs="Times New Roman"/>
+          <w:color w:val="231F20"/>
+          <w:sz w:val="24"/>
+          <w:szCs w:val="24"/>
+        </w:rPr>
+      </w:pPr>
+      <w:r>
+        <w:rPr>
+          <w:rFonts w:ascii="Times New Roman" w:hAnsi="Times New Roman" w:cs="Times New Roman"/>
+          <w:color w:val="231F20"/>
+          <w:sz w:val="24"/>
+          <w:szCs w:val="24"/>
+        </w:rPr>
+        <w:t>    public static boolean isPalindrome(String str){</w:t>
+      </w:r>
+    </w:p>
+    <w:p>
+      <w:pPr>
+        <w:autoSpaceDE w:val="0"/>
+        <w:autoSpaceDN w:val="0"/>
+        <w:adjustRightInd w:val="0"/>
+        <w:spacing w:after="0" w:line="240" w:lineRule="auto"/>
+        <w:jc w:val="both"/>
+        <w:rPr>
+          <w:rFonts w:ascii="Times New Roman" w:hAnsi="Times New Roman" w:cs="Times New Roman"/>
+          <w:color w:val="231F20"/>
+          <w:sz w:val="24"/>
+          <w:szCs w:val="24"/>
+        </w:rPr>
+      </w:pPr>
+      <w:r>
+        <w:rPr>
+          <w:rFonts w:ascii="Times New Roman" w:hAnsi="Times New Roman" w:cs="Times New Roman"/>
+          <w:color w:val="231F20"/>
+          <w:sz w:val="24"/>
+          <w:szCs w:val="24"/>
+        </w:rPr>
+        <w:t xml:space="preserve">        // Start with base case </w:t>
+      </w:r>
+    </w:p>
+    <w:p>
+      <w:pPr>
+        <w:autoSpaceDE w:val="0"/>
+        <w:autoSpaceDN w:val="0"/>
+        <w:adjustRightInd w:val="0"/>
+        <w:spacing w:after="0" w:line="240" w:lineRule="auto"/>
+        <w:jc w:val="both"/>
+        <w:rPr>
+          <w:rFonts w:ascii="Times New Roman" w:hAnsi="Times New Roman" w:cs="Times New Roman"/>
+          <w:color w:val="231F20"/>
+          <w:sz w:val="24"/>
+          <w:szCs w:val="24"/>
+        </w:rPr>
+      </w:pPr>
+      <w:r>
+        <w:rPr>
+          <w:rFonts w:ascii="Times New Roman" w:hAnsi="Times New Roman" w:cs="Times New Roman"/>
+          <w:color w:val="231F20"/>
+          <w:sz w:val="24"/>
+          <w:szCs w:val="24"/>
+        </w:rPr>
+        <w:t>        if (str.length() &lt; 2){</w:t>
+      </w:r>
+    </w:p>
+    <w:p>
+      <w:pPr>
+        <w:autoSpaceDE w:val="0"/>
+        <w:autoSpaceDN w:val="0"/>
+        <w:adjustRightInd w:val="0"/>
+        <w:spacing w:after="0" w:line="240" w:lineRule="auto"/>
+        <w:jc w:val="both"/>
+        <w:rPr>
+          <w:rFonts w:ascii="Times New Roman" w:hAnsi="Times New Roman" w:cs="Times New Roman"/>
+          <w:color w:val="231F20"/>
+          <w:sz w:val="24"/>
+          <w:szCs w:val="24"/>
+        </w:rPr>
+      </w:pPr>
+      <w:r>
+        <w:rPr>
+          <w:rFonts w:ascii="Times New Roman" w:hAnsi="Times New Roman" w:cs="Times New Roman"/>
+          <w:color w:val="231F20"/>
+          <w:sz w:val="24"/>
+          <w:szCs w:val="24"/>
+        </w:rPr>
+        <w:t>            return true;</w:t>
+      </w:r>
+    </w:p>
+    <w:p>
+      <w:pPr>
+        <w:autoSpaceDE w:val="0"/>
+        <w:autoSpaceDN w:val="0"/>
+        <w:adjustRightInd w:val="0"/>
+        <w:spacing w:after="0" w:line="240" w:lineRule="auto"/>
+        <w:jc w:val="both"/>
+        <w:rPr>
+          <w:rFonts w:ascii="Times New Roman" w:hAnsi="Times New Roman" w:cs="Times New Roman"/>
+          <w:color w:val="231F20"/>
+          <w:sz w:val="24"/>
+          <w:szCs w:val="24"/>
+        </w:rPr>
+      </w:pPr>
+      <w:r>
+        <w:rPr>
+          <w:rFonts w:ascii="Times New Roman" w:hAnsi="Times New Roman" w:cs="Times New Roman"/>
+          <w:color w:val="231F20"/>
+          <w:sz w:val="24"/>
+          <w:szCs w:val="24"/>
+        </w:rPr>
+        <w:t>        }</w:t>
+      </w:r>
+    </w:p>
+    <w:p>
+      <w:pPr>
+        <w:autoSpaceDE w:val="0"/>
+        <w:autoSpaceDN w:val="0"/>
+        <w:adjustRightInd w:val="0"/>
+        <w:spacing w:after="0" w:line="240" w:lineRule="auto"/>
+        <w:jc w:val="both"/>
+        <w:rPr>
+          <w:rFonts w:ascii="Times New Roman" w:hAnsi="Times New Roman" w:cs="Times New Roman"/>
+          <w:color w:val="231F20"/>
+          <w:sz w:val="24"/>
+          <w:szCs w:val="24"/>
+        </w:rPr>
+      </w:pPr>
+    </w:p>
+    <w:p>
+      <w:pPr>
+        <w:autoSpaceDE w:val="0"/>
+        <w:autoSpaceDN w:val="0"/>
+        <w:adjustRightInd w:val="0"/>
+        <w:spacing w:after="0" w:line="240" w:lineRule="auto"/>
+        <w:jc w:val="both"/>
+        <w:rPr>
+          <w:rFonts w:ascii="Times New Roman" w:hAnsi="Times New Roman" w:cs="Times New Roman"/>
+          <w:color w:val="231F20"/>
+          <w:sz w:val="24"/>
+          <w:szCs w:val="24"/>
+        </w:rPr>
+      </w:pPr>
+      <w:r>
+        <w:rPr>
+          <w:rFonts w:ascii="Times New Roman" w:hAnsi="Times New Roman" w:cs="Times New Roman"/>
+          <w:color w:val="231F20"/>
+          <w:sz w:val="24"/>
+          <w:szCs w:val="24"/>
+        </w:rPr>
+        <w:t>        //check if first and last letter are the same</w:t>
+      </w:r>
+    </w:p>
+    <w:p>
+      <w:pPr>
+        <w:autoSpaceDE w:val="0"/>
+        <w:autoSpaceDN w:val="0"/>
+        <w:adjustRightInd w:val="0"/>
+        <w:spacing w:after="0" w:line="240" w:lineRule="auto"/>
+        <w:jc w:val="both"/>
+        <w:rPr>
+          <w:rFonts w:ascii="Times New Roman" w:hAnsi="Times New Roman" w:cs="Times New Roman"/>
+          <w:color w:val="231F20"/>
+          <w:sz w:val="24"/>
+          <w:szCs w:val="24"/>
+        </w:rPr>
+      </w:pPr>
+      <w:r>
+        <w:rPr>
+          <w:rFonts w:ascii="Times New Roman" w:hAnsi="Times New Roman" w:cs="Times New Roman"/>
+          <w:color w:val="231F20"/>
+          <w:sz w:val="24"/>
+          <w:szCs w:val="24"/>
+        </w:rPr>
+        <w:t>        if (str.charAt(0) == str.charAt(str.length() - 1)){</w:t>
+      </w:r>
+    </w:p>
+    <w:p>
+      <w:pPr>
+        <w:autoSpaceDE w:val="0"/>
+        <w:autoSpaceDN w:val="0"/>
+        <w:adjustRightInd w:val="0"/>
+        <w:spacing w:after="0" w:line="240" w:lineRule="auto"/>
+        <w:jc w:val="both"/>
+        <w:rPr>
+          <w:rFonts w:ascii="Times New Roman" w:hAnsi="Times New Roman" w:cs="Times New Roman"/>
+          <w:color w:val="231F20"/>
+          <w:sz w:val="24"/>
+          <w:szCs w:val="24"/>
+        </w:rPr>
+      </w:pPr>
+      <w:r>
+        <w:rPr>
+          <w:rFonts w:ascii="Times New Roman" w:hAnsi="Times New Roman" w:cs="Times New Roman"/>
+          <w:color w:val="231F20"/>
+          <w:sz w:val="24"/>
+          <w:szCs w:val="24"/>
+        </w:rPr>
+        <w:t>            //call same logic recursively on rest of string</w:t>
+      </w:r>
+    </w:p>
+    <w:p>
+      <w:pPr>
+        <w:autoSpaceDE w:val="0"/>
+        <w:autoSpaceDN w:val="0"/>
+        <w:adjustRightInd w:val="0"/>
+        <w:spacing w:after="0" w:line="240" w:lineRule="auto"/>
+        <w:jc w:val="both"/>
+        <w:rPr>
+          <w:rFonts w:ascii="Times New Roman" w:hAnsi="Times New Roman" w:cs="Times New Roman"/>
+          <w:color w:val="231F20"/>
+          <w:sz w:val="24"/>
+          <w:szCs w:val="24"/>
+        </w:rPr>
+      </w:pPr>
+      <w:r>
+        <w:rPr>
+          <w:rFonts w:ascii="Times New Roman" w:hAnsi="Times New Roman" w:cs="Times New Roman"/>
+          <w:color w:val="231F20"/>
+          <w:sz w:val="24"/>
+          <w:szCs w:val="24"/>
+        </w:rPr>
+        <w:t>            return isPalindrome(str.substring(1, str.length()-1));</w:t>
+      </w:r>
+    </w:p>
+    <w:p>
+      <w:pPr>
+        <w:autoSpaceDE w:val="0"/>
+        <w:autoSpaceDN w:val="0"/>
+        <w:adjustRightInd w:val="0"/>
+        <w:spacing w:after="0" w:line="240" w:lineRule="auto"/>
+        <w:jc w:val="both"/>
+        <w:rPr>
+          <w:rFonts w:ascii="Times New Roman" w:hAnsi="Times New Roman" w:cs="Times New Roman"/>
+          <w:color w:val="231F20"/>
+          <w:sz w:val="24"/>
+          <w:szCs w:val="24"/>
+        </w:rPr>
+      </w:pPr>
+      <w:r>
+        <w:rPr>
+          <w:rFonts w:ascii="Times New Roman" w:hAnsi="Times New Roman" w:cs="Times New Roman"/>
+          <w:color w:val="231F20"/>
+          <w:sz w:val="24"/>
+          <w:szCs w:val="24"/>
+        </w:rPr>
+        <w:t>        }else{</w:t>
+      </w:r>
+    </w:p>
+    <w:p>
+      <w:pPr>
+        <w:autoSpaceDE w:val="0"/>
+        <w:autoSpaceDN w:val="0"/>
+        <w:adjustRightInd w:val="0"/>
+        <w:spacing w:after="0" w:line="240" w:lineRule="auto"/>
+        <w:jc w:val="both"/>
+        <w:rPr>
+          <w:rFonts w:ascii="Times New Roman" w:hAnsi="Times New Roman" w:cs="Times New Roman"/>
+          <w:color w:val="231F20"/>
+          <w:sz w:val="24"/>
+          <w:szCs w:val="24"/>
+        </w:rPr>
+      </w:pPr>
+      <w:r>
+        <w:rPr>
+          <w:rFonts w:ascii="Times New Roman" w:hAnsi="Times New Roman" w:cs="Times New Roman"/>
+          <w:color w:val="231F20"/>
+          <w:sz w:val="24"/>
+          <w:szCs w:val="24"/>
+        </w:rPr>
+        <w:t>            //conditions not met</w:t>
+      </w:r>
+    </w:p>
+    <w:p>
+      <w:pPr>
+        <w:autoSpaceDE w:val="0"/>
+        <w:autoSpaceDN w:val="0"/>
+        <w:adjustRightInd w:val="0"/>
+        <w:spacing w:after="0" w:line="240" w:lineRule="auto"/>
+        <w:jc w:val="both"/>
+        <w:rPr>
+          <w:rFonts w:ascii="Times New Roman" w:hAnsi="Times New Roman" w:cs="Times New Roman"/>
+          <w:color w:val="231F20"/>
+          <w:sz w:val="24"/>
+          <w:szCs w:val="24"/>
+        </w:rPr>
+      </w:pPr>
+      <w:r>
+        <w:rPr>
+          <w:rFonts w:ascii="Times New Roman" w:hAnsi="Times New Roman" w:cs="Times New Roman"/>
+          <w:color w:val="231F20"/>
+          <w:sz w:val="24"/>
+          <w:szCs w:val="24"/>
+        </w:rPr>
+        <w:t>            return false;</w:t>
+      </w:r>
+    </w:p>
+    <w:p>
+      <w:pPr>
+        <w:autoSpaceDE w:val="0"/>
+        <w:autoSpaceDN w:val="0"/>
+        <w:adjustRightInd w:val="0"/>
+        <w:spacing w:after="0" w:line="240" w:lineRule="auto"/>
+        <w:jc w:val="both"/>
+        <w:rPr>
+          <w:rFonts w:ascii="Times New Roman" w:hAnsi="Times New Roman" w:cs="Times New Roman"/>
+          <w:color w:val="231F20"/>
+          <w:sz w:val="24"/>
+          <w:szCs w:val="24"/>
+        </w:rPr>
+      </w:pPr>
+      <w:r>
+        <w:rPr>
+          <w:rFonts w:ascii="Times New Roman" w:hAnsi="Times New Roman" w:cs="Times New Roman"/>
+          <w:color w:val="231F20"/>
+          <w:sz w:val="24"/>
+          <w:szCs w:val="24"/>
+        </w:rPr>
+        <w:t>        }</w:t>
+      </w:r>
+    </w:p>
+    <w:p>
+      <w:pPr>
+        <w:autoSpaceDE w:val="0"/>
+        <w:autoSpaceDN w:val="0"/>
+        <w:adjustRightInd w:val="0"/>
+        <w:spacing w:after="0" w:line="240" w:lineRule="auto"/>
+        <w:jc w:val="both"/>
+        <w:rPr>
+          <w:rFonts w:ascii="Times New Roman" w:hAnsi="Times New Roman" w:cs="Times New Roman"/>
+          <w:color w:val="231F20"/>
+          <w:sz w:val="24"/>
+          <w:szCs w:val="24"/>
+        </w:rPr>
+      </w:pPr>
+    </w:p>
+    <w:p>
+      <w:pPr>
+        <w:autoSpaceDE w:val="0"/>
+        <w:autoSpaceDN w:val="0"/>
+        <w:adjustRightInd w:val="0"/>
+        <w:spacing w:after="0" w:line="240" w:lineRule="auto"/>
+        <w:jc w:val="both"/>
+        <w:rPr>
+          <w:rFonts w:ascii="Times New Roman" w:hAnsi="Times New Roman" w:cs="Times New Roman"/>
+          <w:color w:val="231F20"/>
+          <w:sz w:val="24"/>
+          <w:szCs w:val="24"/>
+        </w:rPr>
+      </w:pPr>
+      <w:r>
+        <w:rPr>
+          <w:rFonts w:ascii="Times New Roman" w:hAnsi="Times New Roman" w:cs="Times New Roman"/>
+          <w:color w:val="231F20"/>
+          <w:sz w:val="24"/>
+          <w:szCs w:val="24"/>
+        </w:rPr>
+        <w:t xml:space="preserve">    </w:t>
+      </w:r>
+      <w:r>
+        <w:rPr>
+          <w:rFonts w:ascii="Times New Roman" w:hAnsi="Times New Roman" w:cs="Times New Roman"/>
+          <w:color w:val="231F20"/>
+          <w:sz w:val="24"/>
+          <w:szCs w:val="24"/>
+        </w:rPr>
+        <w:t>}</w:t>
+      </w:r>
+    </w:p>
+    <w:p>
+      <w:pPr>
+        <w:autoSpaceDE w:val="0"/>
+        <w:autoSpaceDN w:val="0"/>
+        <w:adjustRightInd w:val="0"/>
+        <w:spacing w:after="0" w:line="240" w:lineRule="auto"/>
+        <w:jc w:val="both"/>
+        <w:rPr>
+          <w:rFonts w:ascii="Times New Roman" w:hAnsi="Times New Roman" w:cs="Times New Roman"/>
+          <w:color w:val="231F20"/>
+          <w:sz w:val="24"/>
+          <w:szCs w:val="24"/>
+        </w:rPr>
+      </w:pPr>
+      <w:r>
+        <w:rPr>
+          <w:rFonts w:ascii="Times New Roman" w:hAnsi="Times New Roman" w:cs="Times New Roman"/>
+          <w:color w:val="231F20"/>
+          <w:sz w:val="24"/>
+          <w:szCs w:val="24"/>
+        </w:rPr>
+        <w:t>    public static void main(String[] args){</w:t>
+      </w:r>
+    </w:p>
+    <w:p>
+      <w:pPr>
+        <w:autoSpaceDE w:val="0"/>
+        <w:autoSpaceDN w:val="0"/>
+        <w:adjustRightInd w:val="0"/>
+        <w:spacing w:after="0" w:line="240" w:lineRule="auto"/>
+        <w:jc w:val="both"/>
+        <w:rPr>
+          <w:rFonts w:ascii="Times New Roman" w:hAnsi="Times New Roman" w:cs="Times New Roman"/>
+          <w:color w:val="231F20"/>
+          <w:sz w:val="24"/>
+          <w:szCs w:val="24"/>
+        </w:rPr>
+      </w:pPr>
+      <w:r>
+        <w:rPr>
+          <w:rFonts w:ascii="Times New Roman" w:hAnsi="Times New Roman" w:cs="Times New Roman"/>
+          <w:color w:val="231F20"/>
+          <w:sz w:val="24"/>
+          <w:szCs w:val="24"/>
+        </w:rPr>
+        <w:t>        //create a scanner to catch user input</w:t>
+      </w:r>
+    </w:p>
+    <w:p>
+      <w:pPr>
+        <w:autoSpaceDE w:val="0"/>
+        <w:autoSpaceDN w:val="0"/>
+        <w:adjustRightInd w:val="0"/>
+        <w:spacing w:after="0" w:line="240" w:lineRule="auto"/>
+        <w:jc w:val="both"/>
+        <w:rPr>
+          <w:rFonts w:ascii="Times New Roman" w:hAnsi="Times New Roman" w:cs="Times New Roman"/>
+          <w:color w:val="231F20"/>
+          <w:sz w:val="24"/>
+          <w:szCs w:val="24"/>
+        </w:rPr>
+      </w:pPr>
+      <w:r>
+        <w:rPr>
+          <w:rFonts w:ascii="Times New Roman" w:hAnsi="Times New Roman" w:cs="Times New Roman"/>
+          <w:color w:val="231F20"/>
+          <w:sz w:val="24"/>
+          <w:szCs w:val="24"/>
+        </w:rPr>
+        <w:t>        Scanner scanner = new Scanner(System.in);</w:t>
+      </w:r>
+    </w:p>
+    <w:p>
+      <w:pPr>
+        <w:autoSpaceDE w:val="0"/>
+        <w:autoSpaceDN w:val="0"/>
+        <w:adjustRightInd w:val="0"/>
+        <w:spacing w:after="0" w:line="240" w:lineRule="auto"/>
+        <w:jc w:val="both"/>
+        <w:rPr>
+          <w:rFonts w:ascii="Times New Roman" w:hAnsi="Times New Roman" w:cs="Times New Roman"/>
+          <w:color w:val="231F20"/>
+          <w:sz w:val="24"/>
+          <w:szCs w:val="24"/>
+        </w:rPr>
+      </w:pPr>
+    </w:p>
+    <w:p>
+      <w:pPr>
+        <w:autoSpaceDE w:val="0"/>
+        <w:autoSpaceDN w:val="0"/>
+        <w:adjustRightInd w:val="0"/>
+        <w:spacing w:after="0" w:line="240" w:lineRule="auto"/>
+        <w:jc w:val="both"/>
+        <w:rPr>
+          <w:rFonts w:ascii="Times New Roman" w:hAnsi="Times New Roman" w:cs="Times New Roman"/>
+          <w:color w:val="231F20"/>
+          <w:sz w:val="24"/>
+          <w:szCs w:val="24"/>
+        </w:rPr>
+      </w:pPr>
+      <w:r>
+        <w:rPr>
+          <w:rFonts w:ascii="Times New Roman" w:hAnsi="Times New Roman" w:cs="Times New Roman"/>
+          <w:color w:val="231F20"/>
+          <w:sz w:val="24"/>
+          <w:szCs w:val="24"/>
+        </w:rPr>
+        <w:t>        //prompt user for input and capture</w:t>
+      </w:r>
+    </w:p>
+    <w:p>
+      <w:pPr>
+        <w:autoSpaceDE w:val="0"/>
+        <w:autoSpaceDN w:val="0"/>
+        <w:adjustRightInd w:val="0"/>
+        <w:spacing w:after="0" w:line="240" w:lineRule="auto"/>
+        <w:jc w:val="both"/>
+        <w:rPr>
+          <w:rFonts w:ascii="Times New Roman" w:hAnsi="Times New Roman" w:cs="Times New Roman"/>
+          <w:color w:val="231F20"/>
+          <w:sz w:val="24"/>
+          <w:szCs w:val="24"/>
+        </w:rPr>
+      </w:pPr>
+      <w:r>
+        <w:rPr>
+          <w:rFonts w:ascii="Times New Roman" w:hAnsi="Times New Roman" w:cs="Times New Roman"/>
+          <w:color w:val="231F20"/>
+          <w:sz w:val="24"/>
+          <w:szCs w:val="24"/>
+        </w:rPr>
+        <w:t>        System.out.print("Please enter a word to see if it is a palindrome: ");</w:t>
+      </w:r>
+    </w:p>
+    <w:p>
+      <w:pPr>
+        <w:autoSpaceDE w:val="0"/>
+        <w:autoSpaceDN w:val="0"/>
+        <w:adjustRightInd w:val="0"/>
+        <w:spacing w:after="0" w:line="240" w:lineRule="auto"/>
+        <w:jc w:val="both"/>
+        <w:rPr>
+          <w:rFonts w:ascii="Times New Roman" w:hAnsi="Times New Roman" w:cs="Times New Roman"/>
+          <w:color w:val="231F20"/>
+          <w:sz w:val="24"/>
+          <w:szCs w:val="24"/>
+        </w:rPr>
+      </w:pPr>
+      <w:r>
+        <w:rPr>
+          <w:rFonts w:ascii="Times New Roman" w:hAnsi="Times New Roman" w:cs="Times New Roman"/>
+          <w:color w:val="231F20"/>
+          <w:sz w:val="24"/>
+          <w:szCs w:val="24"/>
+        </w:rPr>
+        <w:t>        String userInput = scanner.nextLine();</w:t>
+      </w:r>
+    </w:p>
+    <w:p>
+      <w:pPr>
+        <w:autoSpaceDE w:val="0"/>
+        <w:autoSpaceDN w:val="0"/>
+        <w:adjustRightInd w:val="0"/>
+        <w:spacing w:after="0" w:line="240" w:lineRule="auto"/>
+        <w:jc w:val="both"/>
+        <w:rPr>
+          <w:rFonts w:ascii="Times New Roman" w:hAnsi="Times New Roman" w:cs="Times New Roman"/>
+          <w:color w:val="231F20"/>
+          <w:sz w:val="24"/>
+          <w:szCs w:val="24"/>
+        </w:rPr>
+      </w:pPr>
+    </w:p>
+    <w:p>
+      <w:pPr>
+        <w:autoSpaceDE w:val="0"/>
+        <w:autoSpaceDN w:val="0"/>
+        <w:adjustRightInd w:val="0"/>
+        <w:spacing w:after="0" w:line="240" w:lineRule="auto"/>
+        <w:jc w:val="both"/>
+        <w:rPr>
+          <w:rFonts w:ascii="Times New Roman" w:hAnsi="Times New Roman" w:cs="Times New Roman"/>
+          <w:color w:val="231F20"/>
+          <w:sz w:val="24"/>
+          <w:szCs w:val="24"/>
+        </w:rPr>
+      </w:pPr>
+      <w:r>
+        <w:rPr>
+          <w:rFonts w:ascii="Times New Roman" w:hAnsi="Times New Roman" w:cs="Times New Roman"/>
+          <w:color w:val="231F20"/>
+          <w:sz w:val="24"/>
+          <w:szCs w:val="24"/>
+        </w:rPr>
+        <w:t>        //make sure input is all lowercase and no spaces</w:t>
+      </w:r>
+    </w:p>
+    <w:p>
+      <w:pPr>
+        <w:autoSpaceDE w:val="0"/>
+        <w:autoSpaceDN w:val="0"/>
+        <w:adjustRightInd w:val="0"/>
+        <w:spacing w:after="0" w:line="240" w:lineRule="auto"/>
+        <w:jc w:val="both"/>
+        <w:rPr>
+          <w:rFonts w:ascii="Times New Roman" w:hAnsi="Times New Roman" w:cs="Times New Roman"/>
+          <w:color w:val="231F20"/>
+          <w:sz w:val="24"/>
+          <w:szCs w:val="24"/>
+        </w:rPr>
+      </w:pPr>
+      <w:r>
+        <w:rPr>
+          <w:rFonts w:ascii="Times New Roman" w:hAnsi="Times New Roman" w:cs="Times New Roman"/>
+          <w:color w:val="231F20"/>
+          <w:sz w:val="24"/>
+          <w:szCs w:val="24"/>
+        </w:rPr>
+        <w:t>        String fixed = userInput.replaceAll("\\s+", "").toLowerCase();</w:t>
+      </w:r>
+    </w:p>
+    <w:p>
+      <w:pPr>
+        <w:autoSpaceDE w:val="0"/>
+        <w:autoSpaceDN w:val="0"/>
+        <w:adjustRightInd w:val="0"/>
+        <w:spacing w:after="0" w:line="240" w:lineRule="auto"/>
+        <w:jc w:val="both"/>
+        <w:rPr>
+          <w:rFonts w:ascii="Times New Roman" w:hAnsi="Times New Roman" w:cs="Times New Roman"/>
+          <w:color w:val="231F20"/>
+          <w:sz w:val="24"/>
+          <w:szCs w:val="24"/>
+        </w:rPr>
+      </w:pPr>
+    </w:p>
+    <w:p>
+      <w:pPr>
+        <w:autoSpaceDE w:val="0"/>
+        <w:autoSpaceDN w:val="0"/>
+        <w:adjustRightInd w:val="0"/>
+        <w:spacing w:after="0" w:line="240" w:lineRule="auto"/>
+        <w:jc w:val="both"/>
+        <w:rPr>
+          <w:rFonts w:ascii="Times New Roman" w:hAnsi="Times New Roman" w:cs="Times New Roman"/>
+          <w:color w:val="231F20"/>
+          <w:sz w:val="24"/>
+          <w:szCs w:val="24"/>
+        </w:rPr>
+      </w:pPr>
+      <w:r>
+        <w:rPr>
+          <w:rFonts w:ascii="Times New Roman" w:hAnsi="Times New Roman" w:cs="Times New Roman"/>
+          <w:color w:val="231F20"/>
+          <w:sz w:val="24"/>
+          <w:szCs w:val="24"/>
+        </w:rPr>
+        <w:t>        //if isPalindrome returns true print that it is a palindrome, else say it isnt</w:t>
+      </w:r>
+    </w:p>
+    <w:p>
+      <w:pPr>
+        <w:autoSpaceDE w:val="0"/>
+        <w:autoSpaceDN w:val="0"/>
+        <w:adjustRightInd w:val="0"/>
+        <w:spacing w:after="0" w:line="240" w:lineRule="auto"/>
+        <w:jc w:val="both"/>
+        <w:rPr>
+          <w:rFonts w:ascii="Times New Roman" w:hAnsi="Times New Roman" w:cs="Times New Roman"/>
+          <w:color w:val="231F20"/>
+          <w:sz w:val="24"/>
+          <w:szCs w:val="24"/>
+        </w:rPr>
+      </w:pPr>
+      <w:r>
+        <w:rPr>
+          <w:rFonts w:ascii="Times New Roman" w:hAnsi="Times New Roman" w:cs="Times New Roman"/>
+          <w:color w:val="231F20"/>
+          <w:sz w:val="24"/>
+          <w:szCs w:val="24"/>
+        </w:rPr>
+        <w:t>        if (isPalindrome(fixed)) {</w:t>
+      </w:r>
+    </w:p>
+    <w:p>
+      <w:pPr>
+        <w:autoSpaceDE w:val="0"/>
+        <w:autoSpaceDN w:val="0"/>
+        <w:adjustRightInd w:val="0"/>
+        <w:spacing w:after="0" w:line="240" w:lineRule="auto"/>
+        <w:jc w:val="both"/>
+        <w:rPr>
+          <w:rFonts w:ascii="Times New Roman" w:hAnsi="Times New Roman" w:cs="Times New Roman"/>
+          <w:color w:val="231F20"/>
+          <w:sz w:val="24"/>
+          <w:szCs w:val="24"/>
+        </w:rPr>
+      </w:pPr>
+      <w:r>
+        <w:rPr>
+          <w:rFonts w:ascii="Times New Roman" w:hAnsi="Times New Roman" w:cs="Times New Roman"/>
+          <w:color w:val="231F20"/>
+          <w:sz w:val="24"/>
+          <w:szCs w:val="24"/>
+        </w:rPr>
+        <w:t>            System.out.println("" + userInput + " is a Palindrome");</w:t>
+      </w:r>
+    </w:p>
+    <w:p>
+      <w:pPr>
+        <w:autoSpaceDE w:val="0"/>
+        <w:autoSpaceDN w:val="0"/>
+        <w:adjustRightInd w:val="0"/>
+        <w:spacing w:after="0" w:line="240" w:lineRule="auto"/>
+        <w:jc w:val="both"/>
+        <w:rPr>
+          <w:rFonts w:ascii="Times New Roman" w:hAnsi="Times New Roman" w:cs="Times New Roman"/>
+          <w:color w:val="231F20"/>
+          <w:sz w:val="24"/>
+          <w:szCs w:val="24"/>
+        </w:rPr>
+      </w:pPr>
+      <w:r>
+        <w:rPr>
+          <w:rFonts w:ascii="Times New Roman" w:hAnsi="Times New Roman" w:cs="Times New Roman"/>
+          <w:color w:val="231F20"/>
+          <w:sz w:val="24"/>
+          <w:szCs w:val="24"/>
+        </w:rPr>
+        <w:t>        }else{</w:t>
+      </w:r>
+    </w:p>
+    <w:p>
+      <w:pPr>
+        <w:autoSpaceDE w:val="0"/>
+        <w:autoSpaceDN w:val="0"/>
+        <w:adjustRightInd w:val="0"/>
+        <w:spacing w:after="0" w:line="240" w:lineRule="auto"/>
+        <w:jc w:val="both"/>
+        <w:rPr>
+          <w:rFonts w:ascii="Times New Roman" w:hAnsi="Times New Roman" w:cs="Times New Roman"/>
+          <w:color w:val="231F20"/>
+          <w:sz w:val="24"/>
+          <w:szCs w:val="24"/>
+        </w:rPr>
+      </w:pPr>
+      <w:r>
+        <w:rPr>
+          <w:rFonts w:ascii="Times New Roman" w:hAnsi="Times New Roman" w:cs="Times New Roman"/>
+          <w:color w:val="231F20"/>
+          <w:sz w:val="24"/>
+          <w:szCs w:val="24"/>
+        </w:rPr>
+        <w:t>            System.out.println("" + userInput + " is not a Palindrome");</w:t>
+      </w:r>
+    </w:p>
+    <w:p>
+      <w:pPr>
+        <w:autoSpaceDE w:val="0"/>
+        <w:autoSpaceDN w:val="0"/>
+        <w:adjustRightInd w:val="0"/>
+        <w:spacing w:after="0" w:line="240" w:lineRule="auto"/>
+        <w:jc w:val="both"/>
+        <w:rPr>
+          <w:rFonts w:ascii="Times New Roman" w:hAnsi="Times New Roman" w:cs="Times New Roman"/>
+          <w:color w:val="231F20"/>
+          <w:sz w:val="24"/>
+          <w:szCs w:val="24"/>
+        </w:rPr>
+      </w:pPr>
+      <w:r>
+        <w:rPr>
+          <w:rFonts w:ascii="Times New Roman" w:hAnsi="Times New Roman" w:cs="Times New Roman"/>
+          <w:color w:val="231F20"/>
+          <w:sz w:val="24"/>
+          <w:szCs w:val="24"/>
+        </w:rPr>
+        <w:t>        }</w:t>
+      </w:r>
+    </w:p>
+    <w:p>
+      <w:pPr>
+        <w:autoSpaceDE w:val="0"/>
+        <w:autoSpaceDN w:val="0"/>
+        <w:adjustRightInd w:val="0"/>
+        <w:spacing w:after="0" w:line="240" w:lineRule="auto"/>
+        <w:jc w:val="both"/>
+        <w:rPr>
+          <w:rFonts w:ascii="Times New Roman" w:hAnsi="Times New Roman" w:cs="Times New Roman"/>
+          <w:color w:val="231F20"/>
+          <w:sz w:val="24"/>
+          <w:szCs w:val="24"/>
+        </w:rPr>
+      </w:pPr>
+      <w:r>
+        <w:rPr>
+          <w:rFonts w:ascii="Times New Roman" w:hAnsi="Times New Roman" w:cs="Times New Roman"/>
+          <w:color w:val="231F20"/>
+          <w:sz w:val="24"/>
+          <w:szCs w:val="24"/>
+        </w:rPr>
+        <w:t>        scanner.close();</w:t>
+      </w:r>
+    </w:p>
+    <w:p>
+      <w:pPr>
+        <w:autoSpaceDE w:val="0"/>
+        <w:autoSpaceDN w:val="0"/>
+        <w:adjustRightInd w:val="0"/>
+        <w:spacing w:after="0" w:line="240" w:lineRule="auto"/>
+        <w:jc w:val="both"/>
+        <w:rPr>
+          <w:rFonts w:ascii="Times New Roman" w:hAnsi="Times New Roman" w:cs="Times New Roman"/>
+          <w:color w:val="231F20"/>
+          <w:sz w:val="24"/>
+          <w:szCs w:val="24"/>
+        </w:rPr>
+      </w:pPr>
+      <w:r>
+        <w:rPr>
+          <w:rFonts w:ascii="Times New Roman" w:hAnsi="Times New Roman" w:cs="Times New Roman"/>
+          <w:color w:val="231F20"/>
+          <w:sz w:val="24"/>
+          <w:szCs w:val="24"/>
+        </w:rPr>
+        <w:t xml:space="preserve">    } </w:t>
+      </w:r>
+    </w:p>
+    <w:p>
+      <w:pPr>
+        <w:autoSpaceDE w:val="0"/>
+        <w:autoSpaceDN w:val="0"/>
+        <w:adjustRightInd w:val="0"/>
+        <w:spacing w:after="0" w:line="240" w:lineRule="auto"/>
+        <w:jc w:val="both"/>
+        <w:rPr>
+          <w:rFonts w:ascii="Times New Roman" w:hAnsi="Times New Roman" w:cs="Times New Roman"/>
+          <w:color w:val="231F20"/>
+          <w:sz w:val="24"/>
+          <w:szCs w:val="24"/>
+        </w:rPr>
+      </w:pPr>
+      <w:r>
+        <w:rPr>
+          <w:rFonts w:ascii="Times New Roman" w:hAnsi="Times New Roman" w:cs="Times New Roman"/>
+          <w:color w:val="231F20"/>
+          <w:sz w:val="24"/>
+          <w:szCs w:val="24"/>
+        </w:rPr>
+        <w:t>}</w:t>
+      </w:r>
+    </w:p>
+    <w:p>
+      <w:pPr>
+        <w:autoSpaceDE w:val="0"/>
+        <w:autoSpaceDN w:val="0"/>
+        <w:adjustRightInd w:val="0"/>
+        <w:spacing w:after="0" w:line="240" w:lineRule="auto"/>
+        <w:jc w:val="both"/>
+        <w:rPr>
+          <w:rFonts w:ascii="Times New Roman" w:hAnsi="Times New Roman" w:cs="Times New Roman"/>
+          <w:color w:val="231F20"/>
+          <w:sz w:val="24"/>
+          <w:szCs w:val="24"/>
+        </w:rPr>
+      </w:pPr>
+    </w:p>
+    <w:p>
+      <w:pPr>
+        <w:autoSpaceDE w:val="0"/>
+        <w:autoSpaceDN w:val="0"/>
+        <w:adjustRightInd w:val="0"/>
+        <w:spacing w:after="0" w:line="240" w:lineRule="auto"/>
+        <w:jc w:val="both"/>
+        <w:rPr>
+          <w:rFonts w:ascii="Times New Roman" w:hAnsi="Times New Roman" w:cs="Times New Roman"/>
+          <w:color w:val="231F20"/>
+          <w:sz w:val="24"/>
+          <w:szCs w:val="24"/>
+        </w:rPr>
+      </w:pPr>
+    </w:p>
+    <w:p>
+      <w:pPr>
+        <w:autoSpaceDE w:val="0"/>
+        <w:autoSpaceDN w:val="0"/>
+        <w:adjustRightInd w:val="0"/>
+        <w:spacing w:after="0" w:line="240" w:lineRule="auto"/>
+        <w:jc w:val="both"/>
+        <w:rPr>
+          <w:rFonts w:ascii="Times New Roman" w:hAnsi="Times New Roman" w:cs="Times New Roman"/>
+          <w:color w:val="231F20"/>
+          <w:sz w:val="24"/>
+          <w:szCs w:val="24"/>
+        </w:rPr>
+      </w:pPr>
+    </w:p>
+    <w:bookmarkEnd w:id="1"/>
+    <w:p>
+      <w:pPr>
+        <w:autoSpaceDE w:val="0"/>
+        <w:autoSpaceDN w:val="0"/>
+        <w:adjustRightInd w:val="0"/>
+        <w:spacing w:after="0" w:line="240" w:lineRule="auto"/>
         <w:rPr>
           <w:rFonts w:ascii="Times New Roman" w:hAnsi="Times New Roman" w:cs="Times New Roman"/>
           <w:color w:val="FF0000"/>
@@ -2958,9 +3974,50 @@
           <w:color w:val="FF0000"/>
         </w:rPr>
       </w:pPr>
+      <w:r>
+        <w:rPr>
+          <w:rFonts w:ascii="Courier New" w:hAnsi="Courier New" w:cs="Courier New"/>
+          <w:color w:val="FF0000"/>
+        </w:rPr>
+        <w:drawing>
+          <wp:inline distT="0" distB="0" distL="0" distR="0" wp14:anchorId="3BA97DC9" wp14:editId="704B6A19">
+            <wp:extent cx="4915586" cy="2086266"/>
+            <wp:effectExtent l="0" t="0" r="0" b="9525"/>
+            <wp:docPr id="14997056" name="Picture 1"/>
+            <wp:cNvGraphicFramePr>
+              <a:graphicFrameLocks xmlns:a="http://schemas.openxmlformats.org/drawingml/2006/main" noChangeAspect="1"/>
+            </wp:cNvGraphicFramePr>
+            <a:graphic xmlns:a="http://schemas.openxmlformats.org/drawingml/2006/main">
+              <a:graphicData uri="http://schemas.openxmlformats.org/drawingml/2006/picture">
+                <pic:pic xmlns:pic="http://schemas.openxmlformats.org/drawingml/2006/picture">
+                  <pic:nvPicPr>
+                    <pic:cNvPr id="14997056" name=""/>
+                    <pic:cNvPicPr/>
+                  </pic:nvPicPr>
+                  <pic:blipFill>
+                    <a:blip r:embed="rId8"/>
+                    <a:stretch>
+                      <a:fillRect/>
+                    </a:stretch>
+                  </pic:blipFill>
+                  <pic:spPr>
+                    <a:xfrm>
+                      <a:off x="0" y="0"/>
+                      <a:ext cx="4915586" cy="2086266"/>
+                    </a:xfrm>
+                    <a:prstGeom prst="rect">
+                      <a:avLst/>
+                    </a:prstGeom>
+                  </pic:spPr>
+                </pic:pic>
+              </a:graphicData>
+            </a:graphic>
+          </wp:inline>
+        </w:drawing>
+      </w:r>
     </w:p>
     <w:sectPr>
-      <w:headerReference w:type="default" r:id="rId8"/>
+      <w:headerReference w:type="default" r:id="rId9"/>
       <w:pgSz w:w="12240" w:h="15840" w:code="1"/>
       <w:pgMar w:top="1080" w:right="720" w:bottom="2160" w:left="3096" w:header="1080" w:footer="720" w:gutter="0"/>
       <w:pgNumType w:start="1"/>
@@ -2972,7 +4029,7 @@
 </file>
 
 <file path=word/endnotes.xml><?xml version="1.0" encoding="utf-8"?>
-<w:endnotes xmlns:wpc="http://schemas.microsoft.com/office/word/2010/wordprocessingCanvas" xmlns:cx="http://schemas.microsoft.com/office/drawing/2014/chartex" xmlns:cx1="http://schemas.microsoft.com/office/drawing/2015/9/8/chartex" xmlns:cx2="http://schemas.microsoft.com/office/drawing/2015/10/21/chartex" xmlns:cx3="http://schemas.microsoft.com/office/drawing/2016/5/9/chartex" xmlns:cx4="http://schemas.microsoft.com/office/drawing/2016/5/10/chartex" xmlns:cx5="http://schemas.microsoft.com/office/drawing/2016/5/11/chartex" xmlns:cx6="http://schemas.microsoft.com/office/drawing/2016/5/12/chartex" xmlns:cx7="http://schemas.microsoft.com/office/drawing/2016/5/13/chartex" xmlns:cx8="http://schemas.microsoft.com/office/drawing/2016/5/14/chartex" xmlns:mc="http://schemas.openxmlformats.org/markup-compatibility/2006" xmlns:aink="http://schemas.microsoft.com/office/drawing/2016/ink" xmlns:am3d="http://schemas.microsoft.com/office/drawing/2017/model3d" xmlns:o="urn:schemas-microsoft-com:office:office" xmlns:oel="http://schemas.microsoft.com/office/2019/extlst" xmlns:r="http://schemas.openxmlformats.org/officeDocument/2006/relationships" xmlns:m="http://schemas.openxmlformats.org/officeDocument/2006/math" xmlns:v="urn:schemas-microsoft-com:vml" xmlns:wp14="http://schemas.microsoft.com/office/word/2010/wordprocessingDrawing" xmlns:wp="http://schemas.openxmlformats.org/drawingml/2006/wordprocessingDrawing" xmlns:w10="urn:schemas-microsoft-com:office:word" xmlns:w="http://schemas.openxmlformats.org/wordprocessingml/2006/main" xmlns:w14="http://schemas.microsoft.com/office/word/2010/wordml" xmlns:w15="http://schemas.microsoft.com/office/word/2012/wordml" xmlns:w16cex="http://schemas.microsoft.com/office/word/2018/wordml/cex" xmlns:w16cid="http://schemas.microsoft.com/office/word/2016/wordml/cid" xmlns:w16="http://schemas.microsoft.com/office/word/2018/wordml" xmlns:w16du="http://schemas.microsoft.com/office/word/2023/wordml/word16du" xmlns:w16sdtdh="http://schemas.microsoft.com/office/word/2020/wordml/sdtdatahash" xmlns:w16sdtfl="http://schemas.microsoft.com/office/word/2024/wordml/sdtformatlock" xmlns:w16se="http://schemas.microsoft.com/office/word/2015/wordml/symex" xmlns:wpg="http://schemas.microsoft.com/office/word/2010/wordprocessingGroup" xmlns:wpi="http://schemas.microsoft.com/office/word/2010/wordprocessingInk" xmlns:wne="http://schemas.microsoft.com/office/word/2006/wordml" xmlns:wps="http://schemas.microsoft.com/office/word/2010/wordprocessingShape" mc:Ignorable="w14 w15 w16se w16cid w16 w16cex w16sdtdh w16sdtfl w16du wp14">
+<w:endnotes xmlns:wpc="http://schemas.microsoft.com/office/word/2010/wordprocessingCanvas" xmlns:cx="http://schemas.microsoft.com/office/drawing/2014/chartex" xmlns:cx1="http://schemas.microsoft.com/office/drawing/2015/9/8/chartex" xmlns:cx2="http://schemas.microsoft.com/office/drawing/2015/10/21/chartex" xmlns:cx3="http://schemas.microsoft.com/office/drawing/2016/5/9/chartex" xmlns:cx4="http://schemas.microsoft.com/office/drawing/2016/5/10/chartex" xmlns:cx5="http://schemas.microsoft.com/office/drawing/2016/5/11/chartex" xmlns:cx6="http://schemas.microsoft.com/office/drawing/2016/5/12/chartex" xmlns:cx7="http://schemas.microsoft.com/office/drawing/2016/5/13/chartex" xmlns:cx8="http://schemas.microsoft.com/office/drawing/2016/5/14/chartex" xmlns:mc="http://schemas.openxmlformats.org/markup-compatibility/2006" xmlns:aink="http://schemas.microsoft.com/office/drawing/2016/ink" xmlns:am3d="http://schemas.microsoft.com/office/drawing/2017/model3d" xmlns:o="urn:schemas-microsoft-com:office:office" xmlns:oel="http://schemas.microsoft.com/office/2019/extlst" xmlns:r="http://schemas.openxmlformats.org/officeDocument/2006/relationships" xmlns:m="http://schemas.openxmlformats.org/officeDocument/2006/math" xmlns:v="urn:schemas-microsoft-com:vml" xmlns:wp14="http://schemas.microsoft.com/office/word/2010/wordprocessingDrawing" xmlns:wp="http://schemas.openxmlformats.org/drawingml/2006/wordprocessingDrawing" xmlns:w10="urn:schemas-microsoft-com:office:word" xmlns:w="http://schemas.openxmlformats.org/wordprocessingml/2006/main" xmlns:w14="http://schemas.microsoft.com/office/word/2010/wordml" xmlns:w15="http://schemas.microsoft.com/office/word/2012/wordml" xmlns:w16cex="http://schemas.microsoft.com/office/word/2018/wordml/cex" xmlns:w16cid="http://schemas.microsoft.com/office/word/2016/wordml/cid" xmlns:w16="http://schemas.microsoft.com/office/word/2018/wordml" xmlns:w16sdtdh="http://schemas.microsoft.com/office/word/2020/wordml/sdtdatahash" xmlns:w16se="http://schemas.microsoft.com/office/word/2015/wordml/symex" xmlns:wpg="http://schemas.microsoft.com/office/word/2010/wordprocessingGroup" xmlns:wpi="http://schemas.microsoft.com/office/word/2010/wordprocessingInk" xmlns:wne="http://schemas.microsoft.com/office/word/2006/wordml" xmlns:wps="http://schemas.microsoft.com/office/word/2010/wordprocessingShape" mc:Ignorable="w14 w15 w16se w16cid w16 w16cex w16sdtdh wp14">
   <w:endnote w:type="separator" w:id="-1">
     <w:p>
       <w:pPr>
@@ -3001,7 +4058,7 @@
 </file>
 
 <file path=word/footnotes.xml><?xml version="1.0" encoding="utf-8"?>
-<w:footnotes xmlns:wpc="http://schemas.microsoft.com/office/word/2010/wordprocessingCanvas" xmlns:cx="http://schemas.microsoft.com/office/drawing/2014/chartex" xmlns:cx1="http://schemas.microsoft.com/office/drawing/2015/9/8/chartex" xmlns:cx2="http://schemas.microsoft.com/office/drawing/2015/10/21/chartex" xmlns:cx3="http://schemas.microsoft.com/office/drawing/2016/5/9/chartex" xmlns:cx4="http://schemas.microsoft.com/office/drawing/2016/5/10/chartex" xmlns:cx5="http://schemas.microsoft.com/office/drawing/2016/5/11/chartex" xmlns:cx6="http://schemas.microsoft.com/office/drawing/2016/5/12/chartex" xmlns:cx7="http://schemas.microsoft.com/office/drawing/2016/5/13/chartex" xmlns:cx8="http://schemas.microsoft.com/office/drawing/2016/5/14/chartex" xmlns:mc="http://schemas.openxmlformats.org/markup-compatibility/2006" xmlns:aink="http://schemas.microsoft.com/office/drawing/2016/ink" xmlns:am3d="http://schemas.microsoft.com/office/drawing/2017/model3d" xmlns:o="urn:schemas-microsoft-com:office:office" xmlns:oel="http://schemas.microsoft.com/office/2019/extlst" xmlns:r="http://schemas.openxmlformats.org/officeDocument/2006/relationships" xmlns:m="http://schemas.openxmlformats.org/officeDocument/2006/math" xmlns:v="urn:schemas-microsoft-com:vml" xmlns:wp14="http://schemas.microsoft.com/office/word/2010/wordprocessingDrawing" xmlns:wp="http://schemas.openxmlformats.org/drawingml/2006/wordprocessingDrawing" xmlns:w10="urn:schemas-microsoft-com:office:word" xmlns:w="http://schemas.openxmlformats.org/wordprocessingml/2006/main" xmlns:w14="http://schemas.microsoft.com/office/word/2010/wordml" xmlns:w15="http://schemas.microsoft.com/office/word/2012/wordml" xmlns:w16cex="http://schemas.microsoft.com/office/word/2018/wordml/cex" xmlns:w16cid="http://schemas.microsoft.com/office/word/2016/wordml/cid" xmlns:w16="http://schemas.microsoft.com/office/word/2018/wordml" xmlns:w16du="http://schemas.microsoft.com/office/word/2023/wordml/word16du" xmlns:w16sdtdh="http://schemas.microsoft.com/office/word/2020/wordml/sdtdatahash" xmlns:w16sdtfl="http://schemas.microsoft.com/office/word/2024/wordml/sdtformatlock" xmlns:w16se="http://schemas.microsoft.com/office/word/2015/wordml/symex" xmlns:wpg="http://schemas.microsoft.com/office/word/2010/wordprocessingGroup" xmlns:wpi="http://schemas.microsoft.com/office/word/2010/wordprocessingInk" xmlns:wne="http://schemas.microsoft.com/office/word/2006/wordml" xmlns:wps="http://schemas.microsoft.com/office/word/2010/wordprocessingShape" mc:Ignorable="w14 w15 w16se w16cid w16 w16cex w16sdtdh w16sdtfl w16du wp14">
+<w:footnotes xmlns:wpc="http://schemas.microsoft.com/office/word/2010/wordprocessingCanvas" xmlns:cx="http://schemas.microsoft.com/office/drawing/2014/chartex" xmlns:cx1="http://schemas.microsoft.com/office/drawing/2015/9/8/chartex" xmlns:cx2="http://schemas.microsoft.com/office/drawing/2015/10/21/chartex" xmlns:cx3="http://schemas.microsoft.com/office/drawing/2016/5/9/chartex" xmlns:cx4="http://schemas.microsoft.com/office/drawing/2016/5/10/chartex" xmlns:cx5="http://schemas.microsoft.com/office/drawing/2016/5/11/chartex" xmlns:cx6="http://schemas.microsoft.com/office/drawing/2016/5/12/chartex" xmlns:cx7="http://schemas.microsoft.com/office/drawing/2016/5/13/chartex" xmlns:cx8="http://schemas.microsoft.com/office/drawing/2016/5/14/chartex" xmlns:mc="http://schemas.openxmlformats.org/markup-compatibility/2006" xmlns:aink="http://schemas.microsoft.com/office/drawing/2016/ink" xmlns:am3d="http://schemas.microsoft.com/office/drawing/2017/model3d" xmlns:o="urn:schemas-microsoft-com:office:office" xmlns:oel="http://schemas.microsoft.com/office/2019/extlst" xmlns:r="http://schemas.openxmlformats.org/officeDocument/2006/relationships" xmlns:m="http://schemas.openxmlformats.org/officeDocument/2006/math" xmlns:v="urn:schemas-microsoft-com:vml" xmlns:wp14="http://schemas.microsoft.com/office/word/2010/wordprocessingDrawing" xmlns:wp="http://schemas.openxmlformats.org/drawingml/2006/wordprocessingDrawing" xmlns:w10="urn:schemas-microsoft-com:office:word" xmlns:w="http://schemas.openxmlformats.org/wordprocessingml/2006/main" xmlns:w14="http://schemas.microsoft.com/office/word/2010/wordml" xmlns:w15="http://schemas.microsoft.com/office/word/2012/wordml" xmlns:w16cex="http://schemas.microsoft.com/office/word/2018/wordml/cex" xmlns:w16cid="http://schemas.microsoft.com/office/word/2016/wordml/cid" xmlns:w16="http://schemas.microsoft.com/office/word/2018/wordml" xmlns:w16sdtdh="http://schemas.microsoft.com/office/word/2020/wordml/sdtdatahash" xmlns:w16se="http://schemas.microsoft.com/office/word/2015/wordml/symex" xmlns:wpg="http://schemas.microsoft.com/office/word/2010/wordprocessingGroup" xmlns:wpi="http://schemas.microsoft.com/office/word/2010/wordprocessingInk" xmlns:wne="http://schemas.microsoft.com/office/word/2006/wordml" xmlns:wps="http://schemas.microsoft.com/office/word/2010/wordprocessingShape" mc:Ignorable="w14 w15 w16se w16cid w16 w16cex w16sdtdh wp14">
   <w:footnote w:type="separator" w:id="-1">
     <w:p>
       <w:pPr>
@@ -3030,7 +4087,7 @@
 </file>
 
 <file path=word/header1.xml><?xml version="1.0" encoding="utf-8"?>
-<w:hdr xmlns:wpc="http://schemas.microsoft.com/office/word/2010/wordprocessingCanvas" xmlns:cx="http://schemas.microsoft.com/office/drawing/2014/chartex" xmlns:cx1="http://schemas.microsoft.com/office/drawing/2015/9/8/chartex" xmlns:cx2="http://schemas.microsoft.com/office/drawing/2015/10/21/chartex" xmlns:cx3="http://schemas.microsoft.com/office/drawing/2016/5/9/chartex" xmlns:cx4="http://schemas.microsoft.com/office/drawing/2016/5/10/chartex" xmlns:cx5="http://schemas.microsoft.com/office/drawing/2016/5/11/chartex" xmlns:cx6="http://schemas.microsoft.com/office/drawing/2016/5/12/chartex" xmlns:cx7="http://schemas.microsoft.com/office/drawing/2016/5/13/chartex" xmlns:cx8="http://schemas.microsoft.com/office/drawing/2016/5/14/chartex" xmlns:mc="http://schemas.openxmlformats.org/markup-compatibility/2006" xmlns:aink="http://schemas.microsoft.com/office/drawing/2016/ink" xmlns:am3d="http://schemas.microsoft.com/office/drawing/2017/model3d" xmlns:o="urn:schemas-microsoft-com:office:office" xmlns:oel="http://schemas.microsoft.com/office/2019/extlst" xmlns:r="http://schemas.openxmlformats.org/officeDocument/2006/relationships" xmlns:m="http://schemas.openxmlformats.org/officeDocument/2006/math" xmlns:v="urn:schemas-microsoft-com:vml" xmlns:wp14="http://schemas.microsoft.com/office/word/2010/wordprocessingDrawing" xmlns:wp="http://schemas.openxmlformats.org/drawingml/2006/wordprocessingDrawing" xmlns:w10="urn:schemas-microsoft-com:office:word" xmlns:w="http://schemas.openxmlformats.org/wordprocessingml/2006/main" xmlns:w14="http://schemas.microsoft.com/office/word/2010/wordml" xmlns:w15="http://schemas.microsoft.com/office/word/2012/wordml" xmlns:w16cex="http://schemas.microsoft.com/office/word/2018/wordml/cex" xmlns:w16cid="http://schemas.microsoft.com/office/word/2016/wordml/cid" xmlns:w16="http://schemas.microsoft.com/office/word/2018/wordml" xmlns:w16du="http://schemas.microsoft.com/office/word/2023/wordml/word16du" xmlns:w16sdtdh="http://schemas.microsoft.com/office/word/2020/wordml/sdtdatahash" xmlns:w16sdtfl="http://schemas.microsoft.com/office/word/2024/wordml/sdtformatlock" xmlns:w16se="http://schemas.microsoft.com/office/word/2015/wordml/symex" xmlns:wpg="http://schemas.microsoft.com/office/word/2010/wordprocessingGroup" xmlns:wpi="http://schemas.microsoft.com/office/word/2010/wordprocessingInk" xmlns:wne="http://schemas.microsoft.com/office/word/2006/wordml" xmlns:wps="http://schemas.microsoft.com/office/word/2010/wordprocessingShape" mc:Ignorable="w14 w15 w16se w16cid w16 w16cex w16sdtdh w16sdtfl w16du wp14">
+<w:hdr xmlns:wpc="http://schemas.microsoft.com/office/word/2010/wordprocessingCanvas" xmlns:cx="http://schemas.microsoft.com/office/drawing/2014/chartex" xmlns:cx1="http://schemas.microsoft.com/office/drawing/2015/9/8/chartex" xmlns:cx2="http://schemas.microsoft.com/office/drawing/2015/10/21/chartex" xmlns:cx3="http://schemas.microsoft.com/office/drawing/2016/5/9/chartex" xmlns:cx4="http://schemas.microsoft.com/office/drawing/2016/5/10/chartex" xmlns:cx5="http://schemas.microsoft.com/office/drawing/2016/5/11/chartex" xmlns:cx6="http://schemas.microsoft.com/office/drawing/2016/5/12/chartex" xmlns:cx7="http://schemas.microsoft.com/office/drawing/2016/5/13/chartex" xmlns:cx8="http://schemas.microsoft.com/office/drawing/2016/5/14/chartex" xmlns:mc="http://schemas.openxmlformats.org/markup-compatibility/2006" xmlns:aink="http://schemas.microsoft.com/office/drawing/2016/ink" xmlns:am3d="http://schemas.microsoft.com/office/drawing/2017/model3d" xmlns:o="urn:schemas-microsoft-com:office:office" xmlns:oel="http://schemas.microsoft.com/office/2019/extlst" xmlns:r="http://schemas.openxmlformats.org/officeDocument/2006/relationships" xmlns:m="http://schemas.openxmlformats.org/officeDocument/2006/math" xmlns:v="urn:schemas-microsoft-com:vml" xmlns:wp14="http://schemas.microsoft.com/office/word/2010/wordprocessingDrawing" xmlns:wp="http://schemas.openxmlformats.org/drawingml/2006/wordprocessingDrawing" xmlns:w10="urn:schemas-microsoft-com:office:word" xmlns:w="http://schemas.openxmlformats.org/wordprocessingml/2006/main" xmlns:w14="http://schemas.microsoft.com/office/word/2010/wordml" xmlns:w15="http://schemas.microsoft.com/office/word/2012/wordml" xmlns:w16cex="http://schemas.microsoft.com/office/word/2018/wordml/cex" xmlns:w16cid="http://schemas.microsoft.com/office/word/2016/wordml/cid" xmlns:w16="http://schemas.microsoft.com/office/word/2018/wordml" xmlns:w16sdtdh="http://schemas.microsoft.com/office/word/2020/wordml/sdtdatahash" xmlns:w16se="http://schemas.microsoft.com/office/word/2015/wordml/symex" xmlns:wpg="http://schemas.microsoft.com/office/word/2010/wordprocessingGroup" xmlns:wpi="http://schemas.microsoft.com/office/word/2010/wordprocessingInk" xmlns:wne="http://schemas.microsoft.com/office/word/2006/wordml" xmlns:wps="http://schemas.microsoft.com/office/word/2010/wordprocessingShape" mc:Ignorable="w14 w15 w16se w16cid w16 w16cex w16sdtdh wp14">
   <w:p>
     <w:pPr>
       <w:pStyle w:val="Header"/>
@@ -3083,7 +4140,7 @@
 </file>
 
 <file path=word/numbering.xml><?xml version="1.0" encoding="utf-8"?>
-<w:numbering xmlns:wpc="http://schemas.microsoft.com/office/word/2010/wordprocessingCanvas" xmlns:cx="http://schemas.microsoft.com/office/drawing/2014/chartex" xmlns:cx1="http://schemas.microsoft.com/office/drawing/2015/9/8/chartex" xmlns:cx2="http://schemas.microsoft.com/office/drawing/2015/10/21/chartex" xmlns:cx3="http://schemas.microsoft.com/office/drawing/2016/5/9/chartex" xmlns:cx4="http://schemas.microsoft.com/office/drawing/2016/5/10/chartex" xmlns:cx5="http://schemas.microsoft.com/office/drawing/2016/5/11/chartex" xmlns:cx6="http://schemas.microsoft.com/office/drawing/2016/5/12/chartex" xmlns:cx7="http://schemas.microsoft.com/office/drawing/2016/5/13/chartex" xmlns:cx8="http://schemas.microsoft.com/office/drawing/2016/5/14/chartex" xmlns:mc="http://schemas.openxmlformats.org/markup-compatibility/2006" xmlns:aink="http://schemas.microsoft.com/office/drawing/2016/ink" xmlns:am3d="http://schemas.microsoft.com/office/drawing/2017/model3d" xmlns:o="urn:schemas-microsoft-com:office:office" xmlns:oel="http://schemas.microsoft.com/office/2019/extlst" xmlns:r="http://schemas.openxmlformats.org/officeDocument/2006/relationships" xmlns:m="http://schemas.openxmlformats.org/officeDocument/2006/math" xmlns:v="urn:schemas-microsoft-com:vml" xmlns:wp14="http://schemas.microsoft.com/office/word/2010/wordprocessingDrawing" xmlns:wp="http://schemas.openxmlformats.org/drawingml/2006/wordprocessingDrawing" xmlns:w10="urn:schemas-microsoft-com:office:word" xmlns:w="http://schemas.openxmlformats.org/wordprocessingml/2006/main" xmlns:w14="http://schemas.microsoft.com/office/word/2010/wordml" xmlns:w15="http://schemas.microsoft.com/office/word/2012/wordml" xmlns:w16cex="http://schemas.microsoft.com/office/word/2018/wordml/cex" xmlns:w16cid="http://schemas.microsoft.com/office/word/2016/wordml/cid" xmlns:w16="http://schemas.microsoft.com/office/word/2018/wordml" xmlns:w16du="http://schemas.microsoft.com/office/word/2023/wordml/word16du" xmlns:w16sdtdh="http://schemas.microsoft.com/office/word/2020/wordml/sdtdatahash" xmlns:w16sdtfl="http://schemas.microsoft.com/office/word/2024/wordml/sdtformatlock" xmlns:w16se="http://schemas.microsoft.com/office/word/2015/wordml/symex" xmlns:wpg="http://schemas.microsoft.com/office/word/2010/wordprocessingGroup" xmlns:wpi="http://schemas.microsoft.com/office/word/2010/wordprocessingInk" xmlns:wne="http://schemas.microsoft.com/office/word/2006/wordml" xmlns:wps="http://schemas.microsoft.com/office/word/2010/wordprocessingShape" mc:Ignorable="w14 w15 w16se w16cid w16 w16cex w16sdtdh w16sdtfl w16du wp14">
+<w:numbering xmlns:wpc="http://schemas.microsoft.com/office/word/2010/wordprocessingCanvas" xmlns:cx="http://schemas.microsoft.com/office/drawing/2014/chartex" xmlns:cx1="http://schemas.microsoft.com/office/drawing/2015/9/8/chartex" xmlns:cx2="http://schemas.microsoft.com/office/drawing/2015/10/21/chartex" xmlns:cx3="http://schemas.microsoft.com/office/drawing/2016/5/9/chartex" xmlns:cx4="http://schemas.microsoft.com/office/drawing/2016/5/10/chartex" xmlns:cx5="http://schemas.microsoft.com/office/drawing/2016/5/11/chartex" xmlns:cx6="http://schemas.microsoft.com/office/drawing/2016/5/12/chartex" xmlns:cx7="http://schemas.microsoft.com/office/drawing/2016/5/13/chartex" xmlns:cx8="http://schemas.microsoft.com/office/drawing/2016/5/14/chartex" xmlns:mc="http://schemas.openxmlformats.org/markup-compatibility/2006" xmlns:aink="http://schemas.microsoft.com/office/drawing/2016/ink" xmlns:am3d="http://schemas.microsoft.com/office/drawing/2017/model3d" xmlns:o="urn:schemas-microsoft-com:office:office" xmlns:oel="http://schemas.microsoft.com/office/2019/extlst" xmlns:r="http://schemas.openxmlformats.org/officeDocument/2006/relationships" xmlns:m="http://schemas.openxmlformats.org/officeDocument/2006/math" xmlns:v="urn:schemas-microsoft-com:vml" xmlns:wp14="http://schemas.microsoft.com/office/word/2010/wordprocessingDrawing" xmlns:wp="http://schemas.openxmlformats.org/drawingml/2006/wordprocessingDrawing" xmlns:w10="urn:schemas-microsoft-com:office:word" xmlns:w="http://schemas.openxmlformats.org/wordprocessingml/2006/main" xmlns:w14="http://schemas.microsoft.com/office/word/2010/wordml" xmlns:w15="http://schemas.microsoft.com/office/word/2012/wordml" xmlns:w16cex="http://schemas.microsoft.com/office/word/2018/wordml/cex" xmlns:w16cid="http://schemas.microsoft.com/office/word/2016/wordml/cid" xmlns:w16="http://schemas.microsoft.com/office/word/2018/wordml" xmlns:w16sdtdh="http://schemas.microsoft.com/office/word/2020/wordml/sdtdatahash" xmlns:w16se="http://schemas.microsoft.com/office/word/2015/wordml/symex" xmlns:wpg="http://schemas.microsoft.com/office/word/2010/wordprocessingGroup" xmlns:wpi="http://schemas.microsoft.com/office/word/2010/wordprocessingInk" xmlns:wne="http://schemas.microsoft.com/office/word/2006/wordml" xmlns:wps="http://schemas.microsoft.com/office/word/2010/wordprocessingShape" mc:Ignorable="w14 w15 w16se w16cid w16 w16cex w16sdtdh wp14">
   <w:abstractNum w:abstractNumId="0" w15:restartNumberingAfterBreak="0">
     <w:nsid w:val="FFFFFF89"/>
     <w:multiLevelType w:val="singleLevel"/>
@@ -4096,7 +5153,7 @@
 </file>
 
 <file path=word/styles.xml><?xml version="1.0" encoding="utf-8"?>
-<w:styles xmlns:mc="http://schemas.openxmlformats.org/markup-compatibility/2006" xmlns:r="http://schemas.openxmlformats.org/officeDocument/2006/relationships" xmlns:w="http://schemas.openxmlformats.org/wordprocessingml/2006/main" xmlns:w14="http://schemas.microsoft.com/office/word/2010/wordml" xmlns:w15="http://schemas.microsoft.com/office/word/2012/wordml" xmlns:w16cex="http://schemas.microsoft.com/office/word/2018/wordml/cex" xmlns:w16cid="http://schemas.microsoft.com/office/word/2016/wordml/cid" xmlns:w16="http://schemas.microsoft.com/office/word/2018/wordml" xmlns:w16du="http://schemas.microsoft.com/office/word/2023/wordml/word16du" xmlns:w16sdtdh="http://schemas.microsoft.com/office/word/2020/wordml/sdtdatahash" xmlns:w16sdtfl="http://schemas.microsoft.com/office/word/2024/wordml/sdtformatlock" xmlns:w16se="http://schemas.microsoft.com/office/word/2015/wordml/symex" mc:Ignorable="w14 w15 w16se w16cid w16 w16cex w16sdtdh w16sdtfl w16du">
+<w:styles xmlns:mc="http://schemas.openxmlformats.org/markup-compatibility/2006" xmlns:r="http://schemas.openxmlformats.org/officeDocument/2006/relationships" xmlns:w="http://schemas.openxmlformats.org/wordprocessingml/2006/main" xmlns:w14="http://schemas.microsoft.com/office/word/2010/wordml" xmlns:w15="http://schemas.microsoft.com/office/word/2012/wordml" xmlns:w16cex="http://schemas.microsoft.com/office/word/2018/wordml/cex" xmlns:w16cid="http://schemas.microsoft.com/office/word/2016/wordml/cid" xmlns:w16="http://schemas.microsoft.com/office/word/2018/wordml" xmlns:w16sdtdh="http://schemas.microsoft.com/office/word/2020/wordml/sdtdatahash" xmlns:w16se="http://schemas.microsoft.com/office/word/2015/wordml/symex" mc:Ignorable="w14 w15 w16se w16cid w16 w16cex w16sdtdh">
   <w:docDefaults>
     <w:rPrDefault>
       <w:rPr>
@@ -4564,7 +5621,6 @@
   <w:style w:type="character" w:default="1" w:styleId="DefaultParagraphFont">
     <w:name w:val="Default Paragraph Font"/>
     <w:uiPriority w:val="1"/>
-    <w:semiHidden/>
     <w:unhideWhenUsed/>
   </w:style>
   <w:style w:type="table" w:default="1" w:styleId="TableNormal">
@@ -5429,7 +6485,7 @@
 </file>
 
 <file path=word/glossary/document.xml><?xml version="1.0" encoding="utf-8"?>
-<w:glossaryDocument xmlns:wpc="http://schemas.microsoft.com/office/word/2010/wordprocessingCanvas" xmlns:cx="http://schemas.microsoft.com/office/drawing/2014/chartex" xmlns:cx1="http://schemas.microsoft.com/office/drawing/2015/9/8/chartex" xmlns:cx2="http://schemas.microsoft.com/office/drawing/2015/10/21/chartex" xmlns:cx3="http://schemas.microsoft.com/office/drawing/2016/5/9/chartex" xmlns:cx4="http://schemas.microsoft.com/office/drawing/2016/5/10/chartex" xmlns:cx5="http://schemas.microsoft.com/office/drawing/2016/5/11/chartex" xmlns:cx6="http://schemas.microsoft.com/office/drawing/2016/5/12/chartex" xmlns:cx7="http://schemas.microsoft.com/office/drawing/2016/5/13/chartex" xmlns:cx8="http://schemas.microsoft.com/office/drawing/2016/5/14/chartex" xmlns:mc="http://schemas.openxmlformats.org/markup-compatibility/2006" xmlns:aink="http://schemas.microsoft.com/office/drawing/2016/ink" xmlns:am3d="http://schemas.microsoft.com/office/drawing/2017/model3d" xmlns:o="urn:schemas-microsoft-com:office:office" xmlns:oel="http://schemas.microsoft.com/office/2019/extlst" xmlns:r="http://schemas.openxmlformats.org/officeDocument/2006/relationships" xmlns:m="http://schemas.openxmlformats.org/officeDocument/2006/math" xmlns:v="urn:schemas-microsoft-com:vml" xmlns:wp14="http://schemas.microsoft.com/office/word/2010/wordprocessingDrawing" xmlns:wp="http://schemas.openxmlformats.org/drawingml/2006/wordprocessingDrawing" xmlns:w10="urn:schemas-microsoft-com:office:word" xmlns:w="http://schemas.openxmlformats.org/wordprocessingml/2006/main" xmlns:w14="http://schemas.microsoft.com/office/word/2010/wordml" xmlns:w15="http://schemas.microsoft.com/office/word/2012/wordml" xmlns:w16cex="http://schemas.microsoft.com/office/word/2018/wordml/cex" xmlns:w16cid="http://schemas.microsoft.com/office/word/2016/wordml/cid" xmlns:w16="http://schemas.microsoft.com/office/word/2018/wordml" xmlns:w16du="http://schemas.microsoft.com/office/word/2023/wordml/word16du" xmlns:w16sdtdh="http://schemas.microsoft.com/office/word/2020/wordml/sdtdatahash" xmlns:w16sdtfl="http://schemas.microsoft.com/office/word/2024/wordml/sdtformatlock" xmlns:w16se="http://schemas.microsoft.com/office/word/2015/wordml/symex" xmlns:wpg="http://schemas.microsoft.com/office/word/2010/wordprocessingGroup" xmlns:wpi="http://schemas.microsoft.com/office/word/2010/wordprocessingInk" xmlns:wne="http://schemas.microsoft.com/office/word/2006/wordml" xmlns:wps="http://schemas.microsoft.com/office/word/2010/wordprocessingShape" mc:Ignorable="w14 w15 w16se w16cid w16 w16cex w16sdtdh w16sdtfl w16du wp14">
+<w:glossaryDocument xmlns:wpc="http://schemas.microsoft.com/office/word/2010/wordprocessingCanvas" xmlns:cx="http://schemas.microsoft.com/office/drawing/2014/chartex" xmlns:cx1="http://schemas.microsoft.com/office/drawing/2015/9/8/chartex" xmlns:cx2="http://schemas.microsoft.com/office/drawing/2015/10/21/chartex" xmlns:cx3="http://schemas.microsoft.com/office/drawing/2016/5/9/chartex" xmlns:cx4="http://schemas.microsoft.com/office/drawing/2016/5/10/chartex" xmlns:cx5="http://schemas.microsoft.com/office/drawing/2016/5/11/chartex" xmlns:cx6="http://schemas.microsoft.com/office/drawing/2016/5/12/chartex" xmlns:cx7="http://schemas.microsoft.com/office/drawing/2016/5/13/chartex" xmlns:cx8="http://schemas.microsoft.com/office/drawing/2016/5/14/chartex" xmlns:mc="http://schemas.openxmlformats.org/markup-compatibility/2006" xmlns:aink="http://schemas.microsoft.com/office/drawing/2016/ink" xmlns:am3d="http://schemas.microsoft.com/office/drawing/2017/model3d" xmlns:o="urn:schemas-microsoft-com:office:office" xmlns:oel="http://schemas.microsoft.com/office/2019/extlst" xmlns:r="http://schemas.openxmlformats.org/officeDocument/2006/relationships" xmlns:m="http://schemas.openxmlformats.org/officeDocument/2006/math" xmlns:v="urn:schemas-microsoft-com:vml" xmlns:wp14="http://schemas.microsoft.com/office/word/2010/wordprocessingDrawing" xmlns:wp="http://schemas.openxmlformats.org/drawingml/2006/wordprocessingDrawing" xmlns:w10="urn:schemas-microsoft-com:office:word" xmlns:w="http://schemas.openxmlformats.org/wordprocessingml/2006/main" xmlns:w14="http://schemas.microsoft.com/office/word/2010/wordml" xmlns:w15="http://schemas.microsoft.com/office/word/2012/wordml" xmlns:w16cex="http://schemas.microsoft.com/office/word/2018/wordml/cex" xmlns:w16cid="http://schemas.microsoft.com/office/word/2016/wordml/cid" xmlns:w16="http://schemas.microsoft.com/office/word/2018/wordml" xmlns:w16sdtdh="http://schemas.microsoft.com/office/word/2020/wordml/sdtdatahash" xmlns:w16se="http://schemas.microsoft.com/office/word/2015/wordml/symex" xmlns:wpg="http://schemas.microsoft.com/office/word/2010/wordprocessingGroup" xmlns:wpi="http://schemas.microsoft.com/office/word/2010/wordprocessingInk" xmlns:wne="http://schemas.microsoft.com/office/word/2006/wordml" xmlns:wps="http://schemas.microsoft.com/office/word/2010/wordprocessingShape" mc:Ignorable="w14 w15 w16se w16cid w16 w16cex w16sdtdh wp14">
   <w:docParts>
     <w:docPart>
       <w:docPartPr>
@@ -5488,7 +6544,7 @@
 </file>
 
 <file path=word/glossary/fontTable.xml><?xml version="1.0" encoding="utf-8"?>
-<w:fonts xmlns:mc="http://schemas.openxmlformats.org/markup-compatibility/2006" xmlns:r="http://schemas.openxmlformats.org/officeDocument/2006/relationships" xmlns:w="http://schemas.openxmlformats.org/wordprocessingml/2006/main" xmlns:w14="http://schemas.microsoft.com/office/word/2010/wordml" xmlns:w15="http://schemas.microsoft.com/office/word/2012/wordml" xmlns:w16cex="http://schemas.microsoft.com/office/word/2018/wordml/cex" xmlns:w16cid="http://schemas.microsoft.com/office/word/2016/wordml/cid" xmlns:w16="http://schemas.microsoft.com/office/word/2018/wordml" xmlns:w16du="http://schemas.microsoft.com/office/word/2023/wordml/word16du" xmlns:w16sdtdh="http://schemas.microsoft.com/office/word/2020/wordml/sdtdatahash" xmlns:w16sdtfl="http://schemas.microsoft.com/office/word/2024/wordml/sdtformatlock" xmlns:w16se="http://schemas.microsoft.com/office/word/2015/wordml/symex" mc:Ignorable="w14 w15 w16se w16cid w16 w16cex w16sdtdh w16sdtfl w16du">
+<w:fonts xmlns:mc="http://schemas.openxmlformats.org/markup-compatibility/2006" xmlns:r="http://schemas.openxmlformats.org/officeDocument/2006/relationships" xmlns:w="http://schemas.openxmlformats.org/wordprocessingml/2006/main" xmlns:w14="http://schemas.microsoft.com/office/word/2010/wordml" xmlns:w15="http://schemas.microsoft.com/office/word/2012/wordml" xmlns:w16cex="http://schemas.microsoft.com/office/word/2018/wordml/cex" xmlns:w16cid="http://schemas.microsoft.com/office/word/2016/wordml/cid" xmlns:w16="http://schemas.microsoft.com/office/word/2018/wordml" xmlns:w16sdtdh="http://schemas.microsoft.com/office/word/2020/wordml/sdtdatahash" xmlns:w16se="http://schemas.microsoft.com/office/word/2015/wordml/symex" mc:Ignorable="w14 w15 w16se w16cid w16 w16cex w16sdtdh">
   <w:font w:name="Cambria">
     <w:panose1 w:val="02040503050406030204"/>
     <w:charset w:val="00"/>
@@ -5574,7 +6630,7 @@
 </file>
 
 <file path=word/glossary/numbering.xml><?xml version="1.0" encoding="utf-8"?>
-<w:numbering xmlns:wpc="http://schemas.microsoft.com/office/word/2010/wordprocessingCanvas" xmlns:cx="http://schemas.microsoft.com/office/drawing/2014/chartex" xmlns:cx1="http://schemas.microsoft.com/office/drawing/2015/9/8/chartex" xmlns:cx2="http://schemas.microsoft.com/office/drawing/2015/10/21/chartex" xmlns:cx3="http://schemas.microsoft.com/office/drawing/2016/5/9/chartex" xmlns:cx4="http://schemas.microsoft.com/office/drawing/2016/5/10/chartex" xmlns:cx5="http://schemas.microsoft.com/office/drawing/2016/5/11/chartex" xmlns:cx6="http://schemas.microsoft.com/office/drawing/2016/5/12/chartex" xmlns:cx7="http://schemas.microsoft.com/office/drawing/2016/5/13/chartex" xmlns:cx8="http://schemas.microsoft.com/office/drawing/2016/5/14/chartex" xmlns:mc="http://schemas.openxmlformats.org/markup-compatibility/2006" xmlns:aink="http://schemas.microsoft.com/office/drawing/2016/ink" xmlns:am3d="http://schemas.microsoft.com/office/drawing/2017/model3d" xmlns:o="urn:schemas-microsoft-com:office:office" xmlns:oel="http://schemas.microsoft.com/office/2019/extlst" xmlns:r="http://schemas.openxmlformats.org/officeDocument/2006/relationships" xmlns:m="http://schemas.openxmlformats.org/officeDocument/2006/math" xmlns:v="urn:schemas-microsoft-com:vml" xmlns:wp14="http://schemas.microsoft.com/office/word/2010/wordprocessingDrawing" xmlns:wp="http://schemas.openxmlformats.org/drawingml/2006/wordprocessingDrawing" xmlns:w10="urn:schemas-microsoft-com:office:word" xmlns:w="http://schemas.openxmlformats.org/wordprocessingml/2006/main" xmlns:w14="http://schemas.microsoft.com/office/word/2010/wordml" xmlns:w15="http://schemas.microsoft.com/office/word/2012/wordml" xmlns:w16cex="http://schemas.microsoft.com/office/word/2018/wordml/cex" xmlns:w16cid="http://schemas.microsoft.com/office/word/2016/wordml/cid" xmlns:w16="http://schemas.microsoft.com/office/word/2018/wordml" xmlns:w16du="http://schemas.microsoft.com/office/word/2023/wordml/word16du" xmlns:w16sdtdh="http://schemas.microsoft.com/office/word/2020/wordml/sdtdatahash" xmlns:w16sdtfl="http://schemas.microsoft.com/office/word/2024/wordml/sdtformatlock" xmlns:w16se="http://schemas.microsoft.com/office/word/2015/wordml/symex" xmlns:wpg="http://schemas.microsoft.com/office/word/2010/wordprocessingGroup" xmlns:wpi="http://schemas.microsoft.com/office/word/2010/wordprocessingInk" xmlns:wne="http://schemas.microsoft.com/office/word/2006/wordml" xmlns:wps="http://schemas.microsoft.com/office/word/2010/wordprocessingShape" mc:Ignorable="w14 w15 w16se w16cid w16 w16cex w16sdtdh w16sdtfl w16du wp14">
+<w:numbering xmlns:wpc="http://schemas.microsoft.com/office/word/2010/wordprocessingCanvas" xmlns:cx="http://schemas.microsoft.com/office/drawing/2014/chartex" xmlns:cx1="http://schemas.microsoft.com/office/drawing/2015/9/8/chartex" xmlns:cx2="http://schemas.microsoft.com/office/drawing/2015/10/21/chartex" xmlns:cx3="http://schemas.microsoft.com/office/drawing/2016/5/9/chartex" xmlns:cx4="http://schemas.microsoft.com/office/drawing/2016/5/10/chartex" xmlns:cx5="http://schemas.microsoft.com/office/drawing/2016/5/11/chartex" xmlns:cx6="http://schemas.microsoft.com/office/drawing/2016/5/12/chartex" xmlns:cx7="http://schemas.microsoft.com/office/drawing/2016/5/13/chartex" xmlns:cx8="http://schemas.microsoft.com/office/drawing/2016/5/14/chartex" xmlns:mc="http://schemas.openxmlformats.org/markup-compatibility/2006" xmlns:aink="http://schemas.microsoft.com/office/drawing/2016/ink" xmlns:am3d="http://schemas.microsoft.com/office/drawing/2017/model3d" xmlns:o="urn:schemas-microsoft-com:office:office" xmlns:oel="http://schemas.microsoft.com/office/2019/extlst" xmlns:r="http://schemas.openxmlformats.org/officeDocument/2006/relationships" xmlns:m="http://schemas.openxmlformats.org/officeDocument/2006/math" xmlns:v="urn:schemas-microsoft-com:vml" xmlns:wp14="http://schemas.microsoft.com/office/word/2010/wordprocessingDrawing" xmlns:wp="http://schemas.openxmlformats.org/drawingml/2006/wordprocessingDrawing" xmlns:w10="urn:schemas-microsoft-com:office:word" xmlns:w="http://schemas.openxmlformats.org/wordprocessingml/2006/main" xmlns:w14="http://schemas.microsoft.com/office/word/2010/wordml" xmlns:w15="http://schemas.microsoft.com/office/word/2012/wordml" xmlns:w16cex="http://schemas.microsoft.com/office/word/2018/wordml/cex" xmlns:w16cid="http://schemas.microsoft.com/office/word/2016/wordml/cid" xmlns:w16="http://schemas.microsoft.com/office/word/2018/wordml" xmlns:w16sdtdh="http://schemas.microsoft.com/office/word/2020/wordml/sdtdatahash" xmlns:w16se="http://schemas.microsoft.com/office/word/2015/wordml/symex" xmlns:wpg="http://schemas.microsoft.com/office/word/2010/wordprocessingGroup" xmlns:wpi="http://schemas.microsoft.com/office/word/2010/wordprocessingInk" xmlns:wne="http://schemas.microsoft.com/office/word/2006/wordml" xmlns:wps="http://schemas.microsoft.com/office/word/2010/wordprocessingShape" mc:Ignorable="w14 w15 w16se w16cid w16 w16cex w16sdtdh wp14">
   <w:abstractNum w:abstractNumId="0" w15:restartNumberingAfterBreak="0">
     <w:nsid w:val="FFFFFF89"/>
     <w:multiLevelType w:val="singleLevel"/>
@@ -5601,7 +6657,7 @@
 </file>
 
 <file path=word/glossary/settings.xml><?xml version="1.0" encoding="utf-8"?>
-<w:settings xmlns:mc="http://schemas.openxmlformats.org/markup-compatibility/2006" xmlns:o="urn:schemas-microsoft-com:office:office" xmlns:r="http://schemas.openxmlformats.org/officeDocument/2006/relationships" xmlns:m="http://schemas.openxmlformats.org/officeDocument/2006/math" xmlns:v="urn:schemas-microsoft-com:vml" xmlns:w10="urn:schemas-microsoft-com:office:word" xmlns:w="http://schemas.openxmlformats.org/wordprocessingml/2006/main" xmlns:w14="http://schemas.microsoft.com/office/word/2010/wordml" xmlns:w15="http://schemas.microsoft.com/office/word/2012/wordml" xmlns:w16cex="http://schemas.microsoft.com/office/word/2018/wordml/cex" xmlns:w16cid="http://schemas.microsoft.com/office/word/2016/wordml/cid" xmlns:w16="http://schemas.microsoft.com/office/word/2018/wordml" xmlns:w16du="http://schemas.microsoft.com/office/word/2023/wordml/word16du" xmlns:w16sdtdh="http://schemas.microsoft.com/office/word/2020/wordml/sdtdatahash" xmlns:w16sdtfl="http://schemas.microsoft.com/office/word/2024/wordml/sdtformatlock" xmlns:w16se="http://schemas.microsoft.com/office/word/2015/wordml/symex" xmlns:sl="http://schemas.openxmlformats.org/schemaLibrary/2006/main" mc:Ignorable="w14 w15 w16se w16cid w16 w16cex w16sdtdh w16sdtfl w16du">
+<w:settings xmlns:mc="http://schemas.openxmlformats.org/markup-compatibility/2006" xmlns:o="urn:schemas-microsoft-com:office:office" xmlns:r="http://schemas.openxmlformats.org/officeDocument/2006/relationships" xmlns:m="http://schemas.openxmlformats.org/officeDocument/2006/math" xmlns:v="urn:schemas-microsoft-com:vml" xmlns:w10="urn:schemas-microsoft-com:office:word" xmlns:w="http://schemas.openxmlformats.org/wordprocessingml/2006/main" xmlns:w14="http://schemas.microsoft.com/office/word/2010/wordml" xmlns:w15="http://schemas.microsoft.com/office/word/2012/wordml" xmlns:w16cex="http://schemas.microsoft.com/office/word/2018/wordml/cex" xmlns:w16cid="http://schemas.microsoft.com/office/word/2016/wordml/cid" xmlns:w16="http://schemas.microsoft.com/office/word/2018/wordml" xmlns:w16sdtdh="http://schemas.microsoft.com/office/word/2020/wordml/sdtdatahash" xmlns:w16se="http://schemas.microsoft.com/office/word/2015/wordml/symex" xmlns:sl="http://schemas.openxmlformats.org/schemaLibrary/2006/main" mc:Ignorable="w14 w15 w16se w16cid w16 w16cex w16sdtdh">
   <w:view w:val="normal"/>
   <w:defaultTabStop w:val="720"/>
   <w:characterSpacingControl w:val="doNotCompress"/>
@@ -5617,6 +6673,7 @@
   <w:rsids>
     <w:rsidRoot w:val="00324ACF"/>
     <w:rsid w:val="00026EC6"/>
+    <w:rsid w:val="00047ED7"/>
     <w:rsid w:val="00051231"/>
     <w:rsid w:val="000960E2"/>
     <w:rsid w:val="000B52FC"/>
@@ -5639,6 +6696,7 @@
     <w:rsid w:val="005E024E"/>
     <w:rsid w:val="00647D69"/>
     <w:rsid w:val="00660EF5"/>
+    <w:rsid w:val="0068182E"/>
     <w:rsid w:val="00692F90"/>
     <w:rsid w:val="00695677"/>
     <w:rsid w:val="00752B90"/>
@@ -5699,7 +6757,7 @@
 </file>
 
 <file path=word/glossary/styles.xml><?xml version="1.0" encoding="utf-8"?>
-<w:styles xmlns:mc="http://schemas.openxmlformats.org/markup-compatibility/2006" xmlns:r="http://schemas.openxmlformats.org/officeDocument/2006/relationships" xmlns:w="http://schemas.openxmlformats.org/wordprocessingml/2006/main" xmlns:w14="http://schemas.microsoft.com/office/word/2010/wordml" xmlns:w15="http://schemas.microsoft.com/office/word/2012/wordml" xmlns:w16cex="http://schemas.microsoft.com/office/word/2018/wordml/cex" xmlns:w16cid="http://schemas.microsoft.com/office/word/2016/wordml/cid" xmlns:w16="http://schemas.microsoft.com/office/word/2018/wordml" xmlns:w16du="http://schemas.microsoft.com/office/word/2023/wordml/word16du" xmlns:w16sdtdh="http://schemas.microsoft.com/office/word/2020/wordml/sdtdatahash" xmlns:w16sdtfl="http://schemas.microsoft.com/office/word/2024/wordml/sdtformatlock" xmlns:w16se="http://schemas.microsoft.com/office/word/2015/wordml/symex" mc:Ignorable="w14 w15 w16se w16cid w16 w16cex w16sdtdh w16sdtfl w16du">
+<w:styles xmlns:mc="http://schemas.openxmlformats.org/markup-compatibility/2006" xmlns:r="http://schemas.openxmlformats.org/officeDocument/2006/relationships" xmlns:w="http://schemas.openxmlformats.org/wordprocessingml/2006/main" xmlns:w14="http://schemas.microsoft.com/office/word/2010/wordml" xmlns:w15="http://schemas.microsoft.com/office/word/2012/wordml" xmlns:w16cex="http://schemas.microsoft.com/office/word/2018/wordml/cex" xmlns:w16cid="http://schemas.microsoft.com/office/word/2016/wordml/cid" xmlns:w16="http://schemas.microsoft.com/office/word/2018/wordml" xmlns:w16sdtdh="http://schemas.microsoft.com/office/word/2020/wordml/sdtdatahash" xmlns:w16se="http://schemas.microsoft.com/office/word/2015/wordml/symex" mc:Ignorable="w14 w15 w16se w16cid w16 w16cex w16sdtdh">
   <w:docDefaults>
     <w:rPrDefault>
       <w:rPr>
@@ -6163,7 +7221,7 @@
 </file>
 
 <file path=word/glossary/webSettings.xml><?xml version="1.0" encoding="utf-8"?>
-<w:webSettings xmlns:mc="http://schemas.openxmlformats.org/markup-compatibility/2006" xmlns:r="http://schemas.openxmlformats.org/officeDocument/2006/relationships" xmlns:w="http://schemas.openxmlformats.org/wordprocessingml/2006/main" xmlns:w14="http://schemas.microsoft.com/office/word/2010/wordml" xmlns:w15="http://schemas.microsoft.com/office/word/2012/wordml" xmlns:w16cex="http://schemas.microsoft.com/office/word/2018/wordml/cex" xmlns:w16cid="http://schemas.microsoft.com/office/word/2016/wordml/cid" xmlns:w16="http://schemas.microsoft.com/office/word/2018/wordml" xmlns:w16du="http://schemas.microsoft.com/office/word/2023/wordml/word16du" xmlns:w16sdtdh="http://schemas.microsoft.com/office/word/2020/wordml/sdtdatahash" xmlns:w16sdtfl="http://schemas.microsoft.com/office/word/2024/wordml/sdtformatlock" xmlns:w16se="http://schemas.microsoft.com/office/word/2015/wordml/symex" mc:Ignorable="w14 w15 w16se w16cid w16 w16cex w16sdtdh w16sdtfl w16du">
+<w:webSettings xmlns:mc="http://schemas.openxmlformats.org/markup-compatibility/2006" xmlns:r="http://schemas.openxmlformats.org/officeDocument/2006/relationships" xmlns:w="http://schemas.openxmlformats.org/wordprocessingml/2006/main" xmlns:w14="http://schemas.microsoft.com/office/word/2010/wordml" xmlns:w15="http://schemas.microsoft.com/office/word/2012/wordml" xmlns:w16cex="http://schemas.microsoft.com/office/word/2018/wordml/cex" xmlns:w16cid="http://schemas.microsoft.com/office/word/2016/wordml/cid" xmlns:w16="http://schemas.microsoft.com/office/word/2018/wordml" xmlns:w16sdtdh="http://schemas.microsoft.com/office/word/2020/wordml/sdtdatahash" xmlns:w16se="http://schemas.microsoft.com/office/word/2015/wordml/symex" mc:Ignorable="w14 w15 w16se w16cid w16 w16cex w16sdtdh">
   <w:optimizeForBrowser/>
   <w:allowPNG/>
 </w:webSettings>

</xml_diff>